<commit_message>
[system design]:Added HLD diagram and ER Diagram
</commit_message>
<xml_diff>
--- a/docs/2_Requirement/1_SRS.docx
+++ b/docs/2_Requirement/1_SRS.docx
@@ -90,7 +90,7 @@
           </mc:Choice>
           <mc:Fallback>
             <w:pict>
-              <v:line w14:anchorId="66F859AC" id="Straight Connector 2" o:spid="_x0000_s1026" style="position:absolute;flip:y;z-index:251659264;visibility:visible;mso-wrap-style:square;mso-width-percent:0;mso-height-percent:0;mso-wrap-distance-left:9pt;mso-wrap-distance-top:0;mso-wrap-distance-right:9pt;mso-wrap-distance-bottom:0;mso-position-horizontal:absolute;mso-position-horizontal-relative:margin;mso-position-vertical:absolute;mso-position-vertical-relative:page;mso-width-percent:0;mso-height-percent:0;mso-width-relative:margin;mso-height-relative:margin" from="42.35pt,102pt" to="427.2pt,102.85pt" o:gfxdata="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" strokecolor="black [3200]" strokeweight="1.5pt">
+              <v:line w14:anchorId="620FB1E0" id="Straight Connector 2" o:spid="_x0000_s1026" style="position:absolute;flip:y;z-index:251659264;visibility:visible;mso-wrap-style:square;mso-width-percent:0;mso-height-percent:0;mso-wrap-distance-left:9pt;mso-wrap-distance-top:0;mso-wrap-distance-right:9pt;mso-wrap-distance-bottom:0;mso-position-horizontal:absolute;mso-position-horizontal-relative:margin;mso-position-vertical:absolute;mso-position-vertical-relative:page;mso-width-percent:0;mso-height-percent:0;mso-width-relative:margin;mso-height-relative:margin" from="42.35pt,102pt" to="427.2pt,102.85pt" o:gfxdata="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" strokecolor="black [3200]" strokeweight="1.5pt">
                 <v:stroke joinstyle="miter"/>
                 <w10:wrap anchorx="margin" anchory="page"/>
               </v:line>
@@ -2004,7 +2004,7 @@
         </w:rPr>
         <w:t xml:space="preserve">Next.js Documentation – </w:t>
       </w:r>
-      <w:hyperlink r:id="rId8" w:tgtFrame="_new" w:history="1">
+      <w:hyperlink r:id="rId11" w:tgtFrame="_new" w:history="1">
         <w:r>
           <w:rPr>
             <w:rStyle w:val="Hyperlink"/>
@@ -2046,7 +2046,7 @@
         </w:rPr>
         <w:t xml:space="preserve">Prisma Documentation – </w:t>
       </w:r>
-      <w:hyperlink r:id="rId9" w:tgtFrame="_new" w:history="1">
+      <w:hyperlink r:id="rId12" w:tgtFrame="_new" w:history="1">
         <w:r>
           <w:rPr>
             <w:rStyle w:val="Hyperlink"/>
@@ -2092,7 +2092,7 @@
         </w:rPr>
         <w:t xml:space="preserve">face-api.js Documentation – </w:t>
       </w:r>
-      <w:hyperlink r:id="rId10" w:history="1">
+      <w:hyperlink r:id="rId13" w:history="1">
         <w:r>
           <w:rPr>
             <w:rStyle w:val="Hyperlink"/>
@@ -2170,15 +2170,7 @@
           <w:iCs/>
         </w:rPr>
         <w:lastRenderedPageBreak/>
-        <w:t>The application also uses optional browser-based emotion detection, where webcam data is processed locally to maintain user privacy.</w:t>
-      </w:r>
-      <w:r>
-        <w:rPr>
-          <w:rFonts w:ascii="Times New Roman" w:hAnsi="Times New Roman" w:cs="Times New Roman"/>
-          <w:i w:val="0"/>
-          <w:iCs/>
-        </w:rPr>
-        <w:t xml:space="preserve"> </w:t>
+        <w:t xml:space="preserve">The application also uses optional browser-based emotion detection, where webcam data is processed locally to maintain user privacy. </w:t>
       </w:r>
     </w:p>
     <w:p>
@@ -2220,16 +2212,7 @@
           <w:iCs/>
           <w:sz w:val="22"/>
         </w:rPr>
-        <w:t>T</w:t>
-      </w:r>
-      <w:r>
-        <w:rPr>
-          <w:rFonts w:eastAsia="Arial"/>
-          <w:b w:val="0"/>
-          <w:iCs/>
-          <w:sz w:val="22"/>
-        </w:rPr>
-        <w:t>he main functions of MoodMatch include:</w:t>
+        <w:t>The main functions of MoodMatch include:</w:t>
       </w:r>
     </w:p>
     <w:p>
@@ -2492,60 +2475,79 @@
           <w:iCs/>
         </w:rPr>
       </w:pPr>
+      <w:proofErr w:type="spellStart"/>
       <w:r>
         <w:rPr>
           <w:rFonts w:ascii="Times New Roman" w:hAnsi="Times New Roman" w:cs="Times New Roman"/>
           <w:i w:val="0"/>
           <w:iCs/>
         </w:rPr>
-        <w:t>MoodMatch must operate as a web-based application accessible through modern browsers. Privacy constraints require that webcam-based emotion detection is performed entirely on the client side, without transmitting image data to the server. The system must also ensure secure handling of user data through proper validation and authentication mechanisms.</w:t>
-      </w:r>
-    </w:p>
-    <w:p>
-      <w:pPr>
+        <w:t>MoodMatch</w:t>
+      </w:r>
+      <w:proofErr w:type="spellEnd"/>
+      <w:r>
         <w:rPr>
           <w:rFonts w:ascii="Times New Roman" w:hAnsi="Times New Roman" w:cs="Times New Roman"/>
           <w:i w:val="0"/>
           <w:iCs/>
         </w:rPr>
-      </w:pPr>
-      <w:r>
+        <w:t xml:space="preserve"> must operate as a web-based application accessible through modern browsers. Privacy constraints require that webcam-based emotion detection is performed entirely on the client side, without transmitting image data to the server. The system must also ensure secure handling of user data through proper validation and authentication mechanisms. Additionally, the project follows a predefined technology stack including Next.js, TypeScript, and PostgreSQL, which guides the overall design and implementation.</w:t>
+      </w:r>
+    </w:p>
+    <w:p>
+      <w:pPr>
         <w:rPr>
           <w:rFonts w:ascii="Times New Roman" w:hAnsi="Times New Roman" w:cs="Times New Roman"/>
           <w:i w:val="0"/>
           <w:iCs/>
         </w:rPr>
-        <w:t>Additionally, the project follows a predefined technology stack including Next.js, TypeScript, and PostgreSQL, which guides the overall design and implementation</w:t>
-      </w:r>
-      <w:r>
-        <w:rPr>
-          <w:rFonts w:ascii="Times New Roman" w:hAnsi="Times New Roman" w:cs="Times New Roman"/>
-          <w:i w:val="0"/>
-          <w:iCs/>
-        </w:rPr>
-        <w:t>.</w:t>
-      </w:r>
-    </w:p>
-    <w:p>
-      <w:pPr>
-        <w:rPr>
-          <w:rFonts w:ascii="Times New Roman" w:hAnsi="Times New Roman" w:cs="Times New Roman"/>
-          <w:i w:val="0"/>
-          <w:iCs/>
-        </w:rPr>
-      </w:pPr>
-    </w:p>
-    <w:p>
-      <w:pPr>
+      </w:pPr>
+      <w:r>
         <w:rPr>
           <w:rFonts w:ascii="Times New Roman" w:hAnsi="Times New Roman" w:cs="Times New Roman"/>
           <w:b/>
           <w:bCs/>
           <w:i w:val="0"/>
           <w:iCs/>
-          <w:sz w:val="28"/>
-        </w:rPr>
-      </w:pPr>
+        </w:rPr>
+        <w:t>Medical &amp; Mental Health Disclaimer</w:t>
+      </w:r>
+    </w:p>
+    <w:p>
+      <w:pPr>
+        <w:rPr>
+          <w:rFonts w:ascii="Times New Roman" w:hAnsi="Times New Roman" w:cs="Times New Roman"/>
+          <w:i w:val="0"/>
+          <w:iCs/>
+        </w:rPr>
+      </w:pPr>
+      <w:proofErr w:type="spellStart"/>
+      <w:r>
+        <w:rPr>
+          <w:rFonts w:ascii="Times New Roman" w:hAnsi="Times New Roman" w:cs="Times New Roman"/>
+          <w:i w:val="0"/>
+          <w:iCs/>
+        </w:rPr>
+        <w:t>MoodMatch</w:t>
+      </w:r>
+      <w:proofErr w:type="spellEnd"/>
+      <w:r>
+        <w:rPr>
+          <w:rFonts w:ascii="Times New Roman" w:hAnsi="Times New Roman" w:cs="Times New Roman"/>
+          <w:i w:val="0"/>
+          <w:iCs/>
+        </w:rPr>
+        <w:t xml:space="preserve"> is a personal mood journaling and recommendation tool designed solely for self-reflection and general wellness purposes. It is not a medical device, clinical tool, or substitute for professional mental health care. The app does not diagnose, treat, cure, or prevent any mental health condition or disorder. Mood </w:t>
+      </w:r>
+      <w:r>
+        <w:rPr>
+          <w:rFonts w:ascii="Times New Roman" w:hAnsi="Times New Roman" w:cs="Times New Roman"/>
+          <w:i w:val="0"/>
+          <w:iCs/>
+        </w:rPr>
+        <w:lastRenderedPageBreak/>
+        <w:t xml:space="preserve">detection via webcam uses general facial expression recognition and is not clinically validated, and AI-generated recommendations are for general wellness inspiration only — they are not medically reviewed or professionally approved. </w:t>
+      </w:r>
       <w:r>
         <w:rPr>
           <w:rFonts w:ascii="Times New Roman" w:hAnsi="Times New Roman" w:cs="Times New Roman"/>
@@ -2553,9 +2555,38 @@
           <w:bCs/>
           <w:i w:val="0"/>
           <w:iCs/>
+        </w:rPr>
+        <w:t>Users experiencing serious mental health concerns, emotional distress, or crisis situations should seek help from a qualified mental health professional</w:t>
+      </w:r>
+      <w:r>
+        <w:rPr>
+          <w:rFonts w:ascii="Times New Roman" w:hAnsi="Times New Roman" w:cs="Times New Roman"/>
+          <w:i w:val="0"/>
+          <w:iCs/>
+        </w:rPr>
+        <w:t>. No data collected by the app should be interpreted as a clinical assessment of the user's mental state.</w:t>
+      </w:r>
+    </w:p>
+    <w:p>
+      <w:pPr>
+        <w:rPr>
+          <w:rFonts w:ascii="Times New Roman" w:hAnsi="Times New Roman" w:cs="Times New Roman"/>
+          <w:b/>
+          <w:bCs/>
+          <w:i w:val="0"/>
+          <w:iCs/>
           <w:sz w:val="28"/>
         </w:rPr>
-        <w:lastRenderedPageBreak/>
+      </w:pPr>
+      <w:r>
+        <w:rPr>
+          <w:rFonts w:ascii="Times New Roman" w:hAnsi="Times New Roman" w:cs="Times New Roman"/>
+          <w:b/>
+          <w:bCs/>
+          <w:i w:val="0"/>
+          <w:iCs/>
+          <w:sz w:val="28"/>
+        </w:rPr>
         <w:t>2.</w:t>
       </w:r>
       <w:r>
@@ -2723,6 +2754,7 @@
         <w:ind w:left="-5"/>
       </w:pPr>
       <w:r>
+        <w:lastRenderedPageBreak/>
         <w:t>4.</w:t>
       </w:r>
       <w:r>
@@ -2782,7 +2814,6 @@
           <w:rFonts w:ascii="Times New Roman" w:hAnsi="Times New Roman" w:cs="Times New Roman"/>
           <w:i w:val="0"/>
         </w:rPr>
-        <w:lastRenderedPageBreak/>
         <w:t>This feature allows users to register, log in, and securely access the MoodMatch application. It ensures that only authenticated users can access personal data such as mood journals and recommendations.</w:t>
       </w:r>
     </w:p>
@@ -2872,25 +2903,7 @@
           <w:i w:val="0"/>
           <w:sz w:val="24"/>
         </w:rPr>
-        <w:t>4.</w:t>
-      </w:r>
-      <w:r>
-        <w:rPr>
-          <w:rFonts w:ascii="Times New Roman" w:hAnsi="Times New Roman" w:cs="Times New Roman"/>
-          <w:b/>
-          <w:i w:val="0"/>
-          <w:sz w:val="24"/>
-        </w:rPr>
-        <w:t>1</w:t>
-      </w:r>
-      <w:r>
-        <w:rPr>
-          <w:rFonts w:ascii="Times New Roman" w:hAnsi="Times New Roman" w:cs="Times New Roman"/>
-          <w:b/>
-          <w:i w:val="0"/>
-          <w:sz w:val="24"/>
-        </w:rPr>
-        <w:t>.3 Functional Requirements</w:t>
+        <w:t>4.1.3 Functional Requirements</w:t>
       </w:r>
     </w:p>
     <w:p>
@@ -3147,6 +3160,7 @@
           <w:rFonts w:ascii="Times New Roman" w:hAnsi="Times New Roman" w:cs="Times New Roman"/>
           <w:i w:val="0"/>
         </w:rPr>
+        <w:lastRenderedPageBreak/>
         <w:t>• Manual selection → mood recorded</w:t>
       </w:r>
       <w:r>
@@ -3200,7 +3214,6 @@
           <w:i w:val="0"/>
           <w:sz w:val="24"/>
         </w:rPr>
-        <w:lastRenderedPageBreak/>
         <w:t>4.2.3 Functional Requirements</w:t>
       </w:r>
     </w:p>
@@ -3340,21 +3353,38 @@
     </w:p>
     <w:p>
       <w:pPr>
-        <w:rPr>
-          <w:rFonts w:ascii="Times New Roman" w:hAnsi="Times New Roman" w:cs="Times New Roman"/>
-          <w:i w:val="0"/>
-        </w:rPr>
-      </w:pPr>
-      <w:r>
-        <w:rPr>
-          <w:rFonts w:ascii="Times New Roman" w:hAnsi="Times New Roman" w:cs="Times New Roman"/>
-          <w:i w:val="0"/>
-        </w:rPr>
-        <w:t>Generates personalized recommendations based on mood and history.</w:t>
-      </w:r>
-    </w:p>
-    <w:p>
-      <w:pPr>
+        <w:spacing w:after="0" w:line="223" w:lineRule="auto"/>
+        <w:ind w:left="11" w:hanging="11"/>
+        <w:rPr>
+          <w:rFonts w:ascii="Times New Roman" w:hAnsi="Times New Roman" w:cs="Times New Roman"/>
+          <w:i w:val="0"/>
+          <w:iCs/>
+        </w:rPr>
+      </w:pPr>
+      <w:r>
+        <w:rPr>
+          <w:rFonts w:ascii="Times New Roman" w:hAnsi="Times New Roman" w:cs="Times New Roman"/>
+          <w:i w:val="0"/>
+          <w:iCs/>
+        </w:rPr>
+        <w:t>The system generates three personalized recommendations — one music suggestion, one activity, and one reflection — by sending the user's confirmed mood and their last three journal entries as context to the Anthropic AI API. Recommendations are streamed back in real time and saved to the database linked to the current journal entry.</w:t>
+      </w:r>
+    </w:p>
+    <w:p>
+      <w:pPr>
+        <w:spacing w:after="0" w:line="223" w:lineRule="auto"/>
+        <w:ind w:left="11" w:hanging="11"/>
+        <w:rPr>
+          <w:rFonts w:ascii="Times New Roman" w:hAnsi="Times New Roman" w:cs="Times New Roman"/>
+          <w:i w:val="0"/>
+          <w:iCs/>
+        </w:rPr>
+      </w:pPr>
+    </w:p>
+    <w:p>
+      <w:pPr>
+        <w:spacing w:after="0" w:line="223" w:lineRule="auto"/>
+        <w:ind w:left="11" w:hanging="11"/>
         <w:rPr>
           <w:rFonts w:ascii="Times New Roman" w:hAnsi="Times New Roman" w:cs="Times New Roman"/>
           <w:i w:val="0"/>
@@ -3370,6 +3400,16 @@
     </w:p>
     <w:p>
       <w:pPr>
+        <w:spacing w:after="0" w:line="223" w:lineRule="auto"/>
+        <w:ind w:left="11" w:hanging="11"/>
+        <w:rPr>
+          <w:rFonts w:ascii="Times New Roman" w:hAnsi="Times New Roman" w:cs="Times New Roman"/>
+          <w:i w:val="0"/>
+        </w:rPr>
+      </w:pPr>
+    </w:p>
+    <w:p>
+      <w:pPr>
         <w:rPr>
           <w:rFonts w:ascii="Times New Roman" w:hAnsi="Times New Roman" w:cs="Times New Roman"/>
           <w:i w:val="0"/>
@@ -3383,49 +3423,6 @@
           <w:sz w:val="24"/>
         </w:rPr>
         <w:t>4.3.2 Stimulus/Response Sequences</w:t>
-      </w:r>
-    </w:p>
-    <w:p>
-      <w:pPr>
-        <w:ind w:left="720"/>
-        <w:rPr>
-          <w:rFonts w:ascii="Times New Roman" w:hAnsi="Times New Roman" w:cs="Times New Roman"/>
-          <w:i w:val="0"/>
-        </w:rPr>
-      </w:pPr>
-      <w:r>
-        <w:rPr>
-          <w:rFonts w:ascii="Times New Roman" w:hAnsi="Times New Roman" w:cs="Times New Roman"/>
-          <w:i w:val="0"/>
-        </w:rPr>
-        <w:t>• Mood confirmed → AI called → results shown</w:t>
-      </w:r>
-      <w:r>
-        <w:rPr>
-          <w:rFonts w:ascii="Times New Roman" w:hAnsi="Times New Roman" w:cs="Times New Roman"/>
-          <w:i w:val="0"/>
-        </w:rPr>
-        <w:br/>
-        <w:t>• API failure → error message</w:t>
-      </w:r>
-    </w:p>
-    <w:p>
-      <w:pPr>
-        <w:rPr>
-          <w:rFonts w:ascii="Times New Roman" w:hAnsi="Times New Roman" w:cs="Times New Roman"/>
-          <w:b/>
-          <w:i w:val="0"/>
-          <w:sz w:val="24"/>
-        </w:rPr>
-      </w:pPr>
-      <w:r>
-        <w:rPr>
-          <w:rFonts w:ascii="Times New Roman" w:hAnsi="Times New Roman" w:cs="Times New Roman"/>
-          <w:b/>
-          <w:i w:val="0"/>
-          <w:sz w:val="24"/>
-        </w:rPr>
-        <w:t>4.3.3 Functional Requirements</w:t>
       </w:r>
     </w:p>
     <w:p>
@@ -3433,19 +3430,38 @@
         <w:pStyle w:val="ListParagraph"/>
         <w:numPr>
           <w:ilvl w:val="0"/>
-          <w:numId w:val="19"/>
+          <w:numId w:val="37"/>
         </w:numPr>
-        <w:rPr>
-          <w:rFonts w:ascii="Times New Roman" w:hAnsi="Times New Roman" w:cs="Times New Roman"/>
-          <w:i w:val="0"/>
-        </w:rPr>
-      </w:pPr>
-      <w:r>
-        <w:rPr>
-          <w:rFonts w:ascii="Times New Roman" w:hAnsi="Times New Roman" w:cs="Times New Roman"/>
-          <w:i w:val="0"/>
-        </w:rPr>
-        <w:t xml:space="preserve">REQ-1: The system shall generate personalized recommendations based on the user’s current mood. </w:t>
+        <w:ind w:left="426"/>
+        <w:rPr>
+          <w:rFonts w:ascii="Times New Roman" w:hAnsi="Times New Roman" w:cs="Times New Roman"/>
+          <w:i w:val="0"/>
+          <w:iCs/>
+        </w:rPr>
+      </w:pPr>
+      <w:r>
+        <w:rPr>
+          <w:rFonts w:ascii="Times New Roman" w:hAnsi="Times New Roman" w:cs="Times New Roman"/>
+          <w:i w:val="0"/>
+          <w:iCs/>
+        </w:rPr>
+        <w:t>User confirms mood → server fetches last 3 journal entries from DB</w:t>
+      </w:r>
+      <w:r>
+        <w:rPr>
+          <w:rFonts w:ascii="Times New Roman" w:hAnsi="Times New Roman" w:cs="Times New Roman"/>
+          <w:i w:val="0"/>
+          <w:iCs/>
+        </w:rPr>
+        <w:t xml:space="preserve"> as context</w:t>
+      </w:r>
+      <w:r>
+        <w:rPr>
+          <w:rFonts w:ascii="Times New Roman" w:hAnsi="Times New Roman" w:cs="Times New Roman"/>
+          <w:i w:val="0"/>
+          <w:iCs/>
+        </w:rPr>
+        <w:t xml:space="preserve"> → mood + journal context sent to Anthropic API → response streams back token by token → 3 recommendations rendered in UI as they arrive → recommendations saved to DB linked to current journal entry</w:t>
       </w:r>
     </w:p>
     <w:p>
@@ -3453,19 +3469,22 @@
         <w:pStyle w:val="ListParagraph"/>
         <w:numPr>
           <w:ilvl w:val="0"/>
-          <w:numId w:val="19"/>
+          <w:numId w:val="37"/>
         </w:numPr>
-        <w:rPr>
-          <w:rFonts w:ascii="Times New Roman" w:hAnsi="Times New Roman" w:cs="Times New Roman"/>
-          <w:i w:val="0"/>
-        </w:rPr>
-      </w:pPr>
-      <w:r>
-        <w:rPr>
-          <w:rFonts w:ascii="Times New Roman" w:hAnsi="Times New Roman" w:cs="Times New Roman"/>
-          <w:i w:val="0"/>
-        </w:rPr>
-        <w:t xml:space="preserve">REQ-2: The system shall use the user’s recent journal entries to enhance recommendation relevance. </w:t>
+        <w:ind w:left="426"/>
+        <w:rPr>
+          <w:rFonts w:ascii="Times New Roman" w:hAnsi="Times New Roman" w:cs="Times New Roman"/>
+          <w:i w:val="0"/>
+          <w:iCs/>
+        </w:rPr>
+      </w:pPr>
+      <w:r>
+        <w:rPr>
+          <w:rFonts w:ascii="Times New Roman" w:hAnsi="Times New Roman" w:cs="Times New Roman"/>
+          <w:i w:val="0"/>
+          <w:iCs/>
+        </w:rPr>
+        <w:t>New user with no history → mood sent to Anthropic API without context → generic but valid recommendations generated and displayed</w:t>
       </w:r>
     </w:p>
     <w:p>
@@ -3473,19 +3492,22 @@
         <w:pStyle w:val="ListParagraph"/>
         <w:numPr>
           <w:ilvl w:val="0"/>
-          <w:numId w:val="19"/>
+          <w:numId w:val="37"/>
         </w:numPr>
-        <w:rPr>
-          <w:rFonts w:ascii="Times New Roman" w:hAnsi="Times New Roman" w:cs="Times New Roman"/>
-          <w:i w:val="0"/>
-        </w:rPr>
-      </w:pPr>
-      <w:r>
-        <w:rPr>
-          <w:rFonts w:ascii="Times New Roman" w:hAnsi="Times New Roman" w:cs="Times New Roman"/>
-          <w:i w:val="0"/>
-        </w:rPr>
-        <w:t xml:space="preserve">REQ-3: The system shall provide recommendations in multiple categories such as music, activities, and reflections. </w:t>
+        <w:ind w:left="426"/>
+        <w:rPr>
+          <w:rFonts w:ascii="Times New Roman" w:hAnsi="Times New Roman" w:cs="Times New Roman"/>
+          <w:i w:val="0"/>
+          <w:iCs/>
+        </w:rPr>
+      </w:pPr>
+      <w:r>
+        <w:rPr>
+          <w:rFonts w:ascii="Times New Roman" w:hAnsi="Times New Roman" w:cs="Times New Roman"/>
+          <w:i w:val="0"/>
+          <w:iCs/>
+        </w:rPr>
+        <w:t>API failure → error message displayed to user → journal entry still saved → user can retry recommendation generation</w:t>
       </w:r>
     </w:p>
     <w:p>
@@ -3493,19 +3515,39 @@
         <w:pStyle w:val="ListParagraph"/>
         <w:numPr>
           <w:ilvl w:val="0"/>
-          <w:numId w:val="19"/>
+          <w:numId w:val="37"/>
         </w:numPr>
-        <w:rPr>
-          <w:rFonts w:ascii="Times New Roman" w:hAnsi="Times New Roman" w:cs="Times New Roman"/>
-          <w:i w:val="0"/>
-        </w:rPr>
-      </w:pPr>
-      <w:r>
-        <w:rPr>
-          <w:rFonts w:ascii="Times New Roman" w:hAnsi="Times New Roman" w:cs="Times New Roman"/>
-          <w:i w:val="0"/>
-        </w:rPr>
-        <w:t xml:space="preserve">REQ-4: The system shall display the generated recommendations to the user after processing. </w:t>
+        <w:ind w:left="426"/>
+        <w:rPr>
+          <w:rFonts w:ascii="Times New Roman" w:hAnsi="Times New Roman" w:cs="Times New Roman"/>
+          <w:i w:val="0"/>
+        </w:rPr>
+      </w:pPr>
+      <w:r>
+        <w:rPr>
+          <w:rFonts w:ascii="Times New Roman" w:hAnsi="Times New Roman" w:cs="Times New Roman"/>
+          <w:i w:val="0"/>
+        </w:rPr>
+        <w:t>Liked/disliked recommendation → liked field updated in DB → preference reflected in future AI context</w:t>
+      </w:r>
+    </w:p>
+    <w:p>
+      <w:pPr>
+        <w:rPr>
+          <w:rFonts w:ascii="Times New Roman" w:hAnsi="Times New Roman" w:cs="Times New Roman"/>
+          <w:b/>
+          <w:i w:val="0"/>
+          <w:sz w:val="24"/>
+        </w:rPr>
+      </w:pPr>
+      <w:r>
+        <w:rPr>
+          <w:rFonts w:ascii="Times New Roman" w:hAnsi="Times New Roman" w:cs="Times New Roman"/>
+          <w:b/>
+          <w:i w:val="0"/>
+          <w:sz w:val="24"/>
+        </w:rPr>
+        <w:t>4.3.3 Functional Requirements</w:t>
       </w:r>
     </w:p>
     <w:p>
@@ -3513,7 +3555,7 @@
         <w:pStyle w:val="ListParagraph"/>
         <w:numPr>
           <w:ilvl w:val="0"/>
-          <w:numId w:val="19"/>
+          <w:numId w:val="15"/>
         </w:numPr>
         <w:rPr>
           <w:rFonts w:ascii="Times New Roman" w:hAnsi="Times New Roman" w:cs="Times New Roman"/>
@@ -3523,22 +3565,296 @@
       <w:r>
         <w:rPr>
           <w:rFonts w:ascii="Times New Roman" w:hAnsi="Times New Roman" w:cs="Times New Roman"/>
-          <w:i w:val="0"/>
-        </w:rPr>
-        <w:t xml:space="preserve">REQ-5: The system shall handle failures in AI API responses and notify the user appropriately. </w:t>
-      </w:r>
-    </w:p>
-    <w:p>
-      <w:pPr>
-        <w:rPr>
-          <w:rFonts w:ascii="Times New Roman" w:hAnsi="Times New Roman" w:cs="Times New Roman"/>
-          <w:i w:val="0"/>
-        </w:rPr>
-      </w:pPr>
-      <w:r>
-        <w:rPr>
-          <w:rFonts w:ascii="Times New Roman" w:hAnsi="Times New Roman" w:cs="Times New Roman"/>
           <w:b/>
+          <w:bCs/>
+          <w:i w:val="0"/>
+        </w:rPr>
+        <w:lastRenderedPageBreak/>
+        <w:t>REQ-1:</w:t>
+      </w:r>
+      <w:r>
+        <w:rPr>
+          <w:rFonts w:ascii="Times New Roman" w:hAnsi="Times New Roman" w:cs="Times New Roman"/>
+          <w:i w:val="0"/>
+        </w:rPr>
+        <w:t xml:space="preserve"> The system shall generate exactly three recommendations per mood scan — one each in the music, activity, and reflection categories. </w:t>
+      </w:r>
+    </w:p>
+    <w:p>
+      <w:pPr>
+        <w:pStyle w:val="ListParagraph"/>
+        <w:numPr>
+          <w:ilvl w:val="0"/>
+          <w:numId w:val="15"/>
+        </w:numPr>
+        <w:rPr>
+          <w:rFonts w:ascii="Times New Roman" w:hAnsi="Times New Roman" w:cs="Times New Roman"/>
+          <w:i w:val="0"/>
+        </w:rPr>
+      </w:pPr>
+      <w:r>
+        <w:rPr>
+          <w:rFonts w:ascii="Times New Roman" w:hAnsi="Times New Roman" w:cs="Times New Roman"/>
+          <w:b/>
+          <w:bCs/>
+          <w:i w:val="0"/>
+        </w:rPr>
+        <w:t>REQ-2:</w:t>
+      </w:r>
+      <w:r>
+        <w:rPr>
+          <w:rFonts w:ascii="Times New Roman" w:hAnsi="Times New Roman" w:cs="Times New Roman"/>
+          <w:i w:val="0"/>
+        </w:rPr>
+        <w:t xml:space="preserve"> The system shall fetch the authenticated user's last three journal entries from the database and include them as context in the AI prompt. </w:t>
+      </w:r>
+    </w:p>
+    <w:p>
+      <w:pPr>
+        <w:pStyle w:val="ListParagraph"/>
+        <w:numPr>
+          <w:ilvl w:val="0"/>
+          <w:numId w:val="15"/>
+        </w:numPr>
+        <w:rPr>
+          <w:rFonts w:ascii="Times New Roman" w:hAnsi="Times New Roman" w:cs="Times New Roman"/>
+          <w:i w:val="0"/>
+        </w:rPr>
+      </w:pPr>
+      <w:r>
+        <w:rPr>
+          <w:rFonts w:ascii="Times New Roman" w:hAnsi="Times New Roman" w:cs="Times New Roman"/>
+          <w:b/>
+          <w:bCs/>
+          <w:i w:val="0"/>
+        </w:rPr>
+        <w:t>REQ-3:</w:t>
+      </w:r>
+      <w:r>
+        <w:rPr>
+          <w:rFonts w:ascii="Times New Roman" w:hAnsi="Times New Roman" w:cs="Times New Roman"/>
+          <w:i w:val="0"/>
+        </w:rPr>
+        <w:t xml:space="preserve"> The system shall send the current mood label and journal history to the Anthropic API using the </w:t>
+      </w:r>
+      <w:proofErr w:type="spellStart"/>
+      <w:r>
+        <w:rPr>
+          <w:rFonts w:ascii="Times New Roman" w:hAnsi="Times New Roman" w:cs="Times New Roman"/>
+          <w:i w:val="0"/>
+        </w:rPr>
+        <w:t>Vercel</w:t>
+      </w:r>
+      <w:proofErr w:type="spellEnd"/>
+      <w:r>
+        <w:rPr>
+          <w:rFonts w:ascii="Times New Roman" w:hAnsi="Times New Roman" w:cs="Times New Roman"/>
+          <w:i w:val="0"/>
+        </w:rPr>
+        <w:t xml:space="preserve"> AI SDK with streaming enabled. </w:t>
+      </w:r>
+    </w:p>
+    <w:p>
+      <w:pPr>
+        <w:pStyle w:val="ListParagraph"/>
+        <w:numPr>
+          <w:ilvl w:val="0"/>
+          <w:numId w:val="15"/>
+        </w:numPr>
+        <w:rPr>
+          <w:rFonts w:ascii="Times New Roman" w:hAnsi="Times New Roman" w:cs="Times New Roman"/>
+          <w:i w:val="0"/>
+        </w:rPr>
+      </w:pPr>
+      <w:r>
+        <w:rPr>
+          <w:rFonts w:ascii="Times New Roman" w:hAnsi="Times New Roman" w:cs="Times New Roman"/>
+          <w:b/>
+          <w:bCs/>
+          <w:i w:val="0"/>
+        </w:rPr>
+        <w:t>REQ-4:</w:t>
+      </w:r>
+      <w:r>
+        <w:rPr>
+          <w:rFonts w:ascii="Times New Roman" w:hAnsi="Times New Roman" w:cs="Times New Roman"/>
+          <w:i w:val="0"/>
+        </w:rPr>
+        <w:t xml:space="preserve"> The system shall stream AI response tokens to the UI in real time as they are received, without waiting for the full response. </w:t>
+      </w:r>
+    </w:p>
+    <w:p>
+      <w:pPr>
+        <w:pStyle w:val="ListParagraph"/>
+        <w:numPr>
+          <w:ilvl w:val="0"/>
+          <w:numId w:val="15"/>
+        </w:numPr>
+        <w:rPr>
+          <w:rFonts w:ascii="Times New Roman" w:hAnsi="Times New Roman" w:cs="Times New Roman"/>
+          <w:i w:val="0"/>
+        </w:rPr>
+      </w:pPr>
+      <w:r>
+        <w:rPr>
+          <w:rFonts w:ascii="Times New Roman" w:hAnsi="Times New Roman" w:cs="Times New Roman"/>
+          <w:b/>
+          <w:bCs/>
+          <w:i w:val="0"/>
+        </w:rPr>
+        <w:t>REQ-5:</w:t>
+      </w:r>
+      <w:r>
+        <w:rPr>
+          <w:rFonts w:ascii="Times New Roman" w:hAnsi="Times New Roman" w:cs="Times New Roman"/>
+          <w:i w:val="0"/>
+        </w:rPr>
+        <w:t xml:space="preserve"> The system shall parse the streamed response and save each recommendation as a separate row in the Recommendation table, linked to the current journal entry via </w:t>
+      </w:r>
+      <w:proofErr w:type="spellStart"/>
+      <w:r>
+        <w:rPr>
+          <w:rFonts w:ascii="Times New Roman" w:hAnsi="Times New Roman" w:cs="Times New Roman"/>
+          <w:i w:val="0"/>
+        </w:rPr>
+        <w:t>journalEntryId</w:t>
+      </w:r>
+      <w:proofErr w:type="spellEnd"/>
+      <w:r>
+        <w:rPr>
+          <w:rFonts w:ascii="Times New Roman" w:hAnsi="Times New Roman" w:cs="Times New Roman"/>
+          <w:i w:val="0"/>
+        </w:rPr>
+        <w:t xml:space="preserve">. </w:t>
+      </w:r>
+    </w:p>
+    <w:p>
+      <w:pPr>
+        <w:pStyle w:val="ListParagraph"/>
+        <w:numPr>
+          <w:ilvl w:val="0"/>
+          <w:numId w:val="15"/>
+        </w:numPr>
+        <w:rPr>
+          <w:rFonts w:ascii="Times New Roman" w:hAnsi="Times New Roman" w:cs="Times New Roman"/>
+          <w:i w:val="0"/>
+        </w:rPr>
+      </w:pPr>
+      <w:r>
+        <w:rPr>
+          <w:rFonts w:ascii="Times New Roman" w:hAnsi="Times New Roman" w:cs="Times New Roman"/>
+          <w:b/>
+          <w:bCs/>
+        </w:rPr>
+        <w:t xml:space="preserve">REQ-6: </w:t>
+      </w:r>
+      <w:r>
+        <w:rPr>
+          <w:rFonts w:ascii="Times New Roman" w:hAnsi="Times New Roman" w:cs="Times New Roman"/>
+          <w:i w:val="0"/>
+          <w:iCs/>
+        </w:rPr>
+        <w:t>The system shall track user rating for each recommendation using a three-state value — liked, disliked, or unrated — defaulting to unrated upon creation. Users may independently like or dislike each recommendation at any time after it is generated.</w:t>
+      </w:r>
+    </w:p>
+    <w:p>
+      <w:pPr>
+        <w:pStyle w:val="ListParagraph"/>
+        <w:numPr>
+          <w:ilvl w:val="0"/>
+          <w:numId w:val="15"/>
+        </w:numPr>
+        <w:rPr>
+          <w:rFonts w:ascii="Times New Roman" w:hAnsi="Times New Roman" w:cs="Times New Roman"/>
+          <w:i w:val="0"/>
+        </w:rPr>
+      </w:pPr>
+      <w:r>
+        <w:rPr>
+          <w:rFonts w:ascii="Times New Roman" w:hAnsi="Times New Roman" w:cs="Times New Roman"/>
+          <w:b/>
+          <w:bCs/>
+          <w:i w:val="0"/>
+        </w:rPr>
+        <w:t>REQ-7:</w:t>
+      </w:r>
+      <w:r>
+        <w:rPr>
+          <w:rFonts w:ascii="Times New Roman" w:hAnsi="Times New Roman" w:cs="Times New Roman"/>
+          <w:i w:val="0"/>
+        </w:rPr>
+        <w:t xml:space="preserve"> The system shall include previously liked recommendations from journal history in the AI prompt context to improve personalization over time. </w:t>
+      </w:r>
+    </w:p>
+    <w:p>
+      <w:pPr>
+        <w:pStyle w:val="ListParagraph"/>
+        <w:numPr>
+          <w:ilvl w:val="0"/>
+          <w:numId w:val="15"/>
+        </w:numPr>
+        <w:rPr>
+          <w:rFonts w:ascii="Times New Roman" w:hAnsi="Times New Roman" w:cs="Times New Roman"/>
+          <w:i w:val="0"/>
+        </w:rPr>
+      </w:pPr>
+      <w:r>
+        <w:rPr>
+          <w:rFonts w:ascii="Times New Roman" w:hAnsi="Times New Roman" w:cs="Times New Roman"/>
+          <w:b/>
+          <w:bCs/>
+          <w:i w:val="0"/>
+        </w:rPr>
+        <w:t>REQ-8:</w:t>
+      </w:r>
+      <w:r>
+        <w:rPr>
+          <w:rFonts w:ascii="Times New Roman" w:hAnsi="Times New Roman" w:cs="Times New Roman"/>
+          <w:i w:val="0"/>
+        </w:rPr>
+        <w:t xml:space="preserve"> The system shall handle Anthropic API failures gracefully by displaying an error message to the user while preserving the saved journal entry. </w:t>
+      </w:r>
+    </w:p>
+    <w:p>
+      <w:pPr>
+        <w:pStyle w:val="ListParagraph"/>
+        <w:numPr>
+          <w:ilvl w:val="0"/>
+          <w:numId w:val="15"/>
+        </w:numPr>
+        <w:rPr>
+          <w:rFonts w:ascii="Times New Roman" w:hAnsi="Times New Roman" w:cs="Times New Roman"/>
+          <w:i w:val="0"/>
+        </w:rPr>
+      </w:pPr>
+      <w:r>
+        <w:rPr>
+          <w:rFonts w:ascii="Times New Roman" w:hAnsi="Times New Roman" w:cs="Times New Roman"/>
+          <w:b/>
+          <w:bCs/>
+          <w:i w:val="0"/>
+        </w:rPr>
+        <w:t>REQ-9:</w:t>
+      </w:r>
+      <w:r>
+        <w:rPr>
+          <w:rFonts w:ascii="Times New Roman" w:hAnsi="Times New Roman" w:cs="Times New Roman"/>
+          <w:i w:val="0"/>
+        </w:rPr>
+        <w:t xml:space="preserve"> The system shall ensure all recommendation queries are filtered by the authenticated user's ID and never expose another user's recommendations.</w:t>
+      </w:r>
+    </w:p>
+    <w:p>
+      <w:pPr>
+        <w:rPr>
+          <w:rFonts w:ascii="Times New Roman" w:hAnsi="Times New Roman" w:cs="Times New Roman"/>
+          <w:i w:val="0"/>
+        </w:rPr>
+      </w:pPr>
+      <w:r>
+        <w:rPr>
+          <w:rFonts w:ascii="Times New Roman" w:hAnsi="Times New Roman" w:cs="Times New Roman"/>
+          <w:b/>
           <w:i w:val="0"/>
           <w:sz w:val="28"/>
         </w:rPr>
@@ -3624,7 +3940,6 @@
           <w:i w:val="0"/>
           <w:sz w:val="24"/>
         </w:rPr>
-        <w:lastRenderedPageBreak/>
         <w:t>4.4.2 Stimulus/Response Sequences</w:t>
       </w:r>
     </w:p>
@@ -3774,14 +4089,7 @@
           <w:rFonts w:ascii="Times New Roman" w:hAnsi="Times New Roman" w:cs="Times New Roman"/>
           <w:i w:val="0"/>
         </w:rPr>
-        <w:t>REQ-5: The system shall allow users to delete journal entries</w:t>
-      </w:r>
-      <w:r>
-        <w:rPr>
-          <w:rFonts w:ascii="Times New Roman" w:hAnsi="Times New Roman" w:cs="Times New Roman"/>
-          <w:i w:val="0"/>
-        </w:rPr>
-        <w:t>.</w:t>
+        <w:t>REQ-5: The system shall allow users to delete journal entries.</w:t>
       </w:r>
     </w:p>
     <w:p>
@@ -3815,6 +4123,7 @@
           <w:i w:val="0"/>
           <w:sz w:val="24"/>
         </w:rPr>
+        <w:lastRenderedPageBreak/>
         <w:t>4.</w:t>
       </w:r>
       <w:r>
@@ -4670,9 +4979,9 @@
       <w:bookmarkEnd w:id="24"/>
     </w:p>
     <w:sectPr>
-      <w:headerReference w:type="even" r:id="rId11"/>
-      <w:headerReference w:type="default" r:id="rId12"/>
-      <w:headerReference w:type="first" r:id="rId13"/>
+      <w:headerReference w:type="even" r:id="rId14"/>
+      <w:headerReference w:type="default" r:id="rId15"/>
+      <w:headerReference w:type="first" r:id="rId16"/>
       <w:pgSz w:w="12240" w:h="15840"/>
       <w:pgMar w:top="1517" w:right="1299" w:bottom="1623" w:left="1296" w:header="749" w:footer="720" w:gutter="0"/>
       <w:pgNumType w:start="1"/>
@@ -4767,6 +5076,7 @@
       </w:rPr>
       <w:t xml:space="preserve">Requirements Specification for </w:t>
     </w:r>
+    <w:proofErr w:type="spellStart"/>
     <w:r>
       <w:rPr>
         <w:rFonts w:ascii="Times New Roman" w:eastAsia="Times New Roman" w:hAnsi="Times New Roman" w:cs="Times New Roman"/>
@@ -4775,6 +5085,7 @@
       </w:rPr>
       <w:t>MoodMatch</w:t>
     </w:r>
+    <w:proofErr w:type="spellEnd"/>
     <w:r>
       <w:rPr>
         <w:rFonts w:ascii="Times New Roman" w:eastAsia="Times New Roman" w:hAnsi="Times New Roman" w:cs="Times New Roman"/>
@@ -4873,6 +5184,7 @@
       </w:rPr>
       <w:t xml:space="preserve">Requirements Specification for </w:t>
     </w:r>
+    <w:proofErr w:type="spellStart"/>
     <w:r>
       <w:rPr>
         <w:rFonts w:ascii="Times New Roman" w:eastAsia="Times New Roman" w:hAnsi="Times New Roman" w:cs="Times New Roman"/>
@@ -4881,6 +5193,7 @@
       </w:rPr>
       <w:t>MoodMatch</w:t>
     </w:r>
+    <w:proofErr w:type="spellEnd"/>
     <w:r>
       <w:rPr>
         <w:rFonts w:ascii="Times New Roman" w:eastAsia="Times New Roman" w:hAnsi="Times New Roman" w:cs="Times New Roman"/>
@@ -4979,6 +5292,7 @@
       </w:rPr>
       <w:t xml:space="preserve">Requirements Specification for </w:t>
     </w:r>
+    <w:proofErr w:type="spellStart"/>
     <w:r>
       <w:rPr>
         <w:rFonts w:ascii="Times New Roman" w:eastAsia="Times New Roman" w:hAnsi="Times New Roman" w:cs="Times New Roman"/>
@@ -4987,6 +5301,7 @@
       </w:rPr>
       <w:t>MoodMatch</w:t>
     </w:r>
+    <w:proofErr w:type="spellEnd"/>
     <w:r>
       <w:rPr>
         <w:rFonts w:ascii="Times New Roman" w:eastAsia="Times New Roman" w:hAnsi="Times New Roman" w:cs="Times New Roman"/>
@@ -5053,6 +5368,118 @@
 <file path=word/numbering.xml><?xml version="1.0" encoding="utf-8"?>
 <w:numbering xmlns:wpc="http://schemas.microsoft.com/office/word/2010/wordprocessingCanvas" xmlns:cx="http://schemas.microsoft.com/office/drawing/2014/chartex" xmlns:cx1="http://schemas.microsoft.com/office/drawing/2015/9/8/chartex" xmlns:cx2="http://schemas.microsoft.com/office/drawing/2015/10/21/chartex" xmlns:cx3="http://schemas.microsoft.com/office/drawing/2016/5/9/chartex" xmlns:cx4="http://schemas.microsoft.com/office/drawing/2016/5/10/chartex" xmlns:cx5="http://schemas.microsoft.com/office/drawing/2016/5/11/chartex" xmlns:cx6="http://schemas.microsoft.com/office/drawing/2016/5/12/chartex" xmlns:cx7="http://schemas.microsoft.com/office/drawing/2016/5/13/chartex" xmlns:cx8="http://schemas.microsoft.com/office/drawing/2016/5/14/chartex" xmlns:mc="http://schemas.openxmlformats.org/markup-compatibility/2006" xmlns:aink="http://schemas.microsoft.com/office/drawing/2016/ink" xmlns:am3d="http://schemas.microsoft.com/office/drawing/2017/model3d" xmlns:o="urn:schemas-microsoft-com:office:office" xmlns:oel="http://schemas.microsoft.com/office/2019/extlst" xmlns:r="http://schemas.openxmlformats.org/officeDocument/2006/relationships" xmlns:m="http://schemas.openxmlformats.org/officeDocument/2006/math" xmlns:v="urn:schemas-microsoft-com:vml" xmlns:wp14="http://schemas.microsoft.com/office/word/2010/wordprocessingDrawing" xmlns:wp="http://schemas.openxmlformats.org/drawingml/2006/wordprocessingDrawing" xmlns:w10="urn:schemas-microsoft-com:office:word" xmlns:w="http://schemas.openxmlformats.org/wordprocessingml/2006/main" xmlns:w14="http://schemas.microsoft.com/office/word/2010/wordml" xmlns:w15="http://schemas.microsoft.com/office/word/2012/wordml" xmlns:w16cex="http://schemas.microsoft.com/office/word/2018/wordml/cex" xmlns:w16cid="http://schemas.microsoft.com/office/word/2016/wordml/cid" xmlns:w16="http://schemas.microsoft.com/office/word/2018/wordml" xmlns:w16du="http://schemas.microsoft.com/office/word/2023/wordml/word16du" xmlns:w16sdtdh="http://schemas.microsoft.com/office/word/2020/wordml/sdtdatahash" xmlns:w16sdtfl="http://schemas.microsoft.com/office/word/2024/wordml/sdtformatlock" xmlns:w16se="http://schemas.microsoft.com/office/word/2015/wordml/symex" xmlns:wpg="http://schemas.microsoft.com/office/word/2010/wordprocessingGroup" xmlns:wpi="http://schemas.microsoft.com/office/word/2010/wordprocessingInk" xmlns:wne="http://schemas.microsoft.com/office/word/2006/wordml" xmlns:wps="http://schemas.microsoft.com/office/word/2010/wordprocessingShape" mc:Ignorable="w14 w15 w16se w16cid w16 w16cex w16sdtdh w16sdtfl w16du wp14">
   <w:abstractNum w:abstractNumId="0" w15:restartNumberingAfterBreak="0">
+    <w:nsid w:val="04555D25"/>
+    <w:multiLevelType w:val="hybridMultilevel"/>
+    <w:tmpl w:val="21A86BC4"/>
+    <w:lvl w:ilvl="0" w:tplc="77662248">
+      <w:numFmt w:val="bullet"/>
+      <w:lvlText w:val="•"/>
+      <w:lvlJc w:val="left"/>
+      <w:pPr>
+        <w:ind w:left="1070" w:hanging="360"/>
+      </w:pPr>
+      <w:rPr>
+        <w:rFonts w:ascii="Times New Roman" w:eastAsia="Arial" w:hAnsi="Times New Roman" w:cs="Times New Roman" w:hint="default"/>
+      </w:rPr>
+    </w:lvl>
+    <w:lvl w:ilvl="1" w:tplc="40090003" w:tentative="1">
+      <w:start w:val="1"/>
+      <w:numFmt w:val="bullet"/>
+      <w:lvlText w:val="o"/>
+      <w:lvlJc w:val="left"/>
+      <w:pPr>
+        <w:ind w:left="1440" w:hanging="360"/>
+      </w:pPr>
+      <w:rPr>
+        <w:rFonts w:ascii="Courier New" w:hAnsi="Courier New" w:cs="Courier New" w:hint="default"/>
+      </w:rPr>
+    </w:lvl>
+    <w:lvl w:ilvl="2" w:tplc="40090005" w:tentative="1">
+      <w:start w:val="1"/>
+      <w:numFmt w:val="bullet"/>
+      <w:lvlText w:val=""/>
+      <w:lvlJc w:val="left"/>
+      <w:pPr>
+        <w:ind w:left="2160" w:hanging="360"/>
+      </w:pPr>
+      <w:rPr>
+        <w:rFonts w:ascii="Wingdings" w:hAnsi="Wingdings" w:hint="default"/>
+      </w:rPr>
+    </w:lvl>
+    <w:lvl w:ilvl="3" w:tplc="40090001" w:tentative="1">
+      <w:start w:val="1"/>
+      <w:numFmt w:val="bullet"/>
+      <w:lvlText w:val=""/>
+      <w:lvlJc w:val="left"/>
+      <w:pPr>
+        <w:ind w:left="2880" w:hanging="360"/>
+      </w:pPr>
+      <w:rPr>
+        <w:rFonts w:ascii="Symbol" w:hAnsi="Symbol" w:hint="default"/>
+      </w:rPr>
+    </w:lvl>
+    <w:lvl w:ilvl="4" w:tplc="40090003" w:tentative="1">
+      <w:start w:val="1"/>
+      <w:numFmt w:val="bullet"/>
+      <w:lvlText w:val="o"/>
+      <w:lvlJc w:val="left"/>
+      <w:pPr>
+        <w:ind w:left="3600" w:hanging="360"/>
+      </w:pPr>
+      <w:rPr>
+        <w:rFonts w:ascii="Courier New" w:hAnsi="Courier New" w:cs="Courier New" w:hint="default"/>
+      </w:rPr>
+    </w:lvl>
+    <w:lvl w:ilvl="5" w:tplc="40090005" w:tentative="1">
+      <w:start w:val="1"/>
+      <w:numFmt w:val="bullet"/>
+      <w:lvlText w:val=""/>
+      <w:lvlJc w:val="left"/>
+      <w:pPr>
+        <w:ind w:left="4320" w:hanging="360"/>
+      </w:pPr>
+      <w:rPr>
+        <w:rFonts w:ascii="Wingdings" w:hAnsi="Wingdings" w:hint="default"/>
+      </w:rPr>
+    </w:lvl>
+    <w:lvl w:ilvl="6" w:tplc="40090001" w:tentative="1">
+      <w:start w:val="1"/>
+      <w:numFmt w:val="bullet"/>
+      <w:lvlText w:val=""/>
+      <w:lvlJc w:val="left"/>
+      <w:pPr>
+        <w:ind w:left="5040" w:hanging="360"/>
+      </w:pPr>
+      <w:rPr>
+        <w:rFonts w:ascii="Symbol" w:hAnsi="Symbol" w:hint="default"/>
+      </w:rPr>
+    </w:lvl>
+    <w:lvl w:ilvl="7" w:tplc="40090003" w:tentative="1">
+      <w:start w:val="1"/>
+      <w:numFmt w:val="bullet"/>
+      <w:lvlText w:val="o"/>
+      <w:lvlJc w:val="left"/>
+      <w:pPr>
+        <w:ind w:left="5760" w:hanging="360"/>
+      </w:pPr>
+      <w:rPr>
+        <w:rFonts w:ascii="Courier New" w:hAnsi="Courier New" w:cs="Courier New" w:hint="default"/>
+      </w:rPr>
+    </w:lvl>
+    <w:lvl w:ilvl="8" w:tplc="40090005" w:tentative="1">
+      <w:start w:val="1"/>
+      <w:numFmt w:val="bullet"/>
+      <w:lvlText w:val=""/>
+      <w:lvlJc w:val="left"/>
+      <w:pPr>
+        <w:ind w:left="6480" w:hanging="360"/>
+      </w:pPr>
+      <w:rPr>
+        <w:rFonts w:ascii="Wingdings" w:hAnsi="Wingdings" w:hint="default"/>
+      </w:rPr>
+    </w:lvl>
+  </w:abstractNum>
+  <w:abstractNum w:abstractNumId="1" w15:restartNumberingAfterBreak="0">
     <w:nsid w:val="0A091F9C"/>
     <w:multiLevelType w:val="hybridMultilevel"/>
     <w:tmpl w:val="C51EB5E6"/>
@@ -5165,7 +5592,120 @@
       </w:rPr>
     </w:lvl>
   </w:abstractNum>
-  <w:abstractNum w:abstractNumId="1" w15:restartNumberingAfterBreak="0">
+  <w:abstractNum w:abstractNumId="2" w15:restartNumberingAfterBreak="0">
+    <w:nsid w:val="0A75500C"/>
+    <w:multiLevelType w:val="hybridMultilevel"/>
+    <w:tmpl w:val="218C6D1E"/>
+    <w:lvl w:ilvl="0" w:tplc="40090001">
+      <w:start w:val="1"/>
+      <w:numFmt w:val="bullet"/>
+      <w:lvlText w:val=""/>
+      <w:lvlJc w:val="left"/>
+      <w:pPr>
+        <w:ind w:left="1430" w:hanging="360"/>
+      </w:pPr>
+      <w:rPr>
+        <w:rFonts w:ascii="Symbol" w:hAnsi="Symbol" w:hint="default"/>
+      </w:rPr>
+    </w:lvl>
+    <w:lvl w:ilvl="1" w:tplc="40090003" w:tentative="1">
+      <w:start w:val="1"/>
+      <w:numFmt w:val="bullet"/>
+      <w:lvlText w:val="o"/>
+      <w:lvlJc w:val="left"/>
+      <w:pPr>
+        <w:ind w:left="2150" w:hanging="360"/>
+      </w:pPr>
+      <w:rPr>
+        <w:rFonts w:ascii="Courier New" w:hAnsi="Courier New" w:cs="Courier New" w:hint="default"/>
+      </w:rPr>
+    </w:lvl>
+    <w:lvl w:ilvl="2" w:tplc="40090005" w:tentative="1">
+      <w:start w:val="1"/>
+      <w:numFmt w:val="bullet"/>
+      <w:lvlText w:val=""/>
+      <w:lvlJc w:val="left"/>
+      <w:pPr>
+        <w:ind w:left="2870" w:hanging="360"/>
+      </w:pPr>
+      <w:rPr>
+        <w:rFonts w:ascii="Wingdings" w:hAnsi="Wingdings" w:hint="default"/>
+      </w:rPr>
+    </w:lvl>
+    <w:lvl w:ilvl="3" w:tplc="40090001" w:tentative="1">
+      <w:start w:val="1"/>
+      <w:numFmt w:val="bullet"/>
+      <w:lvlText w:val=""/>
+      <w:lvlJc w:val="left"/>
+      <w:pPr>
+        <w:ind w:left="3590" w:hanging="360"/>
+      </w:pPr>
+      <w:rPr>
+        <w:rFonts w:ascii="Symbol" w:hAnsi="Symbol" w:hint="default"/>
+      </w:rPr>
+    </w:lvl>
+    <w:lvl w:ilvl="4" w:tplc="40090003" w:tentative="1">
+      <w:start w:val="1"/>
+      <w:numFmt w:val="bullet"/>
+      <w:lvlText w:val="o"/>
+      <w:lvlJc w:val="left"/>
+      <w:pPr>
+        <w:ind w:left="4310" w:hanging="360"/>
+      </w:pPr>
+      <w:rPr>
+        <w:rFonts w:ascii="Courier New" w:hAnsi="Courier New" w:cs="Courier New" w:hint="default"/>
+      </w:rPr>
+    </w:lvl>
+    <w:lvl w:ilvl="5" w:tplc="40090005" w:tentative="1">
+      <w:start w:val="1"/>
+      <w:numFmt w:val="bullet"/>
+      <w:lvlText w:val=""/>
+      <w:lvlJc w:val="left"/>
+      <w:pPr>
+        <w:ind w:left="5030" w:hanging="360"/>
+      </w:pPr>
+      <w:rPr>
+        <w:rFonts w:ascii="Wingdings" w:hAnsi="Wingdings" w:hint="default"/>
+      </w:rPr>
+    </w:lvl>
+    <w:lvl w:ilvl="6" w:tplc="40090001" w:tentative="1">
+      <w:start w:val="1"/>
+      <w:numFmt w:val="bullet"/>
+      <w:lvlText w:val=""/>
+      <w:lvlJc w:val="left"/>
+      <w:pPr>
+        <w:ind w:left="5750" w:hanging="360"/>
+      </w:pPr>
+      <w:rPr>
+        <w:rFonts w:ascii="Symbol" w:hAnsi="Symbol" w:hint="default"/>
+      </w:rPr>
+    </w:lvl>
+    <w:lvl w:ilvl="7" w:tplc="40090003" w:tentative="1">
+      <w:start w:val="1"/>
+      <w:numFmt w:val="bullet"/>
+      <w:lvlText w:val="o"/>
+      <w:lvlJc w:val="left"/>
+      <w:pPr>
+        <w:ind w:left="6470" w:hanging="360"/>
+      </w:pPr>
+      <w:rPr>
+        <w:rFonts w:ascii="Courier New" w:hAnsi="Courier New" w:cs="Courier New" w:hint="default"/>
+      </w:rPr>
+    </w:lvl>
+    <w:lvl w:ilvl="8" w:tplc="40090005" w:tentative="1">
+      <w:start w:val="1"/>
+      <w:numFmt w:val="bullet"/>
+      <w:lvlText w:val=""/>
+      <w:lvlJc w:val="left"/>
+      <w:pPr>
+        <w:ind w:left="7190" w:hanging="360"/>
+      </w:pPr>
+      <w:rPr>
+        <w:rFonts w:ascii="Wingdings" w:hAnsi="Wingdings" w:hint="default"/>
+      </w:rPr>
+    </w:lvl>
+  </w:abstractNum>
+  <w:abstractNum w:abstractNumId="3" w15:restartNumberingAfterBreak="0">
     <w:nsid w:val="0A796984"/>
     <w:multiLevelType w:val="hybridMultilevel"/>
     <w:tmpl w:val="789EEB48"/>
@@ -5277,7 +5817,156 @@
       </w:rPr>
     </w:lvl>
   </w:abstractNum>
-  <w:abstractNum w:abstractNumId="2" w15:restartNumberingAfterBreak="0">
+  <w:abstractNum w:abstractNumId="4" w15:restartNumberingAfterBreak="0">
+    <w:nsid w:val="0C5A0A30"/>
+    <w:multiLevelType w:val="multilevel"/>
+    <w:tmpl w:val="101AFE50"/>
+    <w:lvl w:ilvl="0">
+      <w:start w:val="1"/>
+      <w:numFmt w:val="bullet"/>
+      <w:lvlText w:val=""/>
+      <w:lvlJc w:val="left"/>
+      <w:pPr>
+        <w:tabs>
+          <w:tab w:val="num" w:pos="720"/>
+        </w:tabs>
+        <w:ind w:left="720" w:hanging="360"/>
+      </w:pPr>
+      <w:rPr>
+        <w:rFonts w:ascii="Symbol" w:hAnsi="Symbol" w:hint="default"/>
+        <w:sz w:val="20"/>
+      </w:rPr>
+    </w:lvl>
+    <w:lvl w:ilvl="1" w:tentative="1">
+      <w:start w:val="1"/>
+      <w:numFmt w:val="bullet"/>
+      <w:lvlText w:val="o"/>
+      <w:lvlJc w:val="left"/>
+      <w:pPr>
+        <w:tabs>
+          <w:tab w:val="num" w:pos="1440"/>
+        </w:tabs>
+        <w:ind w:left="1440" w:hanging="360"/>
+      </w:pPr>
+      <w:rPr>
+        <w:rFonts w:ascii="Courier New" w:hAnsi="Courier New" w:hint="default"/>
+        <w:sz w:val="20"/>
+      </w:rPr>
+    </w:lvl>
+    <w:lvl w:ilvl="2" w:tentative="1">
+      <w:start w:val="1"/>
+      <w:numFmt w:val="bullet"/>
+      <w:lvlText w:val=""/>
+      <w:lvlJc w:val="left"/>
+      <w:pPr>
+        <w:tabs>
+          <w:tab w:val="num" w:pos="2160"/>
+        </w:tabs>
+        <w:ind w:left="2160" w:hanging="360"/>
+      </w:pPr>
+      <w:rPr>
+        <w:rFonts w:ascii="Wingdings" w:hAnsi="Wingdings" w:hint="default"/>
+        <w:sz w:val="20"/>
+      </w:rPr>
+    </w:lvl>
+    <w:lvl w:ilvl="3" w:tentative="1">
+      <w:start w:val="1"/>
+      <w:numFmt w:val="bullet"/>
+      <w:lvlText w:val=""/>
+      <w:lvlJc w:val="left"/>
+      <w:pPr>
+        <w:tabs>
+          <w:tab w:val="num" w:pos="2880"/>
+        </w:tabs>
+        <w:ind w:left="2880" w:hanging="360"/>
+      </w:pPr>
+      <w:rPr>
+        <w:rFonts w:ascii="Wingdings" w:hAnsi="Wingdings" w:hint="default"/>
+        <w:sz w:val="20"/>
+      </w:rPr>
+    </w:lvl>
+    <w:lvl w:ilvl="4" w:tentative="1">
+      <w:start w:val="1"/>
+      <w:numFmt w:val="bullet"/>
+      <w:lvlText w:val=""/>
+      <w:lvlJc w:val="left"/>
+      <w:pPr>
+        <w:tabs>
+          <w:tab w:val="num" w:pos="3600"/>
+        </w:tabs>
+        <w:ind w:left="3600" w:hanging="360"/>
+      </w:pPr>
+      <w:rPr>
+        <w:rFonts w:ascii="Wingdings" w:hAnsi="Wingdings" w:hint="default"/>
+        <w:sz w:val="20"/>
+      </w:rPr>
+    </w:lvl>
+    <w:lvl w:ilvl="5" w:tentative="1">
+      <w:start w:val="1"/>
+      <w:numFmt w:val="bullet"/>
+      <w:lvlText w:val=""/>
+      <w:lvlJc w:val="left"/>
+      <w:pPr>
+        <w:tabs>
+          <w:tab w:val="num" w:pos="4320"/>
+        </w:tabs>
+        <w:ind w:left="4320" w:hanging="360"/>
+      </w:pPr>
+      <w:rPr>
+        <w:rFonts w:ascii="Wingdings" w:hAnsi="Wingdings" w:hint="default"/>
+        <w:sz w:val="20"/>
+      </w:rPr>
+    </w:lvl>
+    <w:lvl w:ilvl="6" w:tentative="1">
+      <w:start w:val="1"/>
+      <w:numFmt w:val="bullet"/>
+      <w:lvlText w:val=""/>
+      <w:lvlJc w:val="left"/>
+      <w:pPr>
+        <w:tabs>
+          <w:tab w:val="num" w:pos="5040"/>
+        </w:tabs>
+        <w:ind w:left="5040" w:hanging="360"/>
+      </w:pPr>
+      <w:rPr>
+        <w:rFonts w:ascii="Wingdings" w:hAnsi="Wingdings" w:hint="default"/>
+        <w:sz w:val="20"/>
+      </w:rPr>
+    </w:lvl>
+    <w:lvl w:ilvl="7" w:tentative="1">
+      <w:start w:val="1"/>
+      <w:numFmt w:val="bullet"/>
+      <w:lvlText w:val=""/>
+      <w:lvlJc w:val="left"/>
+      <w:pPr>
+        <w:tabs>
+          <w:tab w:val="num" w:pos="5760"/>
+        </w:tabs>
+        <w:ind w:left="5760" w:hanging="360"/>
+      </w:pPr>
+      <w:rPr>
+        <w:rFonts w:ascii="Wingdings" w:hAnsi="Wingdings" w:hint="default"/>
+        <w:sz w:val="20"/>
+      </w:rPr>
+    </w:lvl>
+    <w:lvl w:ilvl="8" w:tentative="1">
+      <w:start w:val="1"/>
+      <w:numFmt w:val="bullet"/>
+      <w:lvlText w:val=""/>
+      <w:lvlJc w:val="left"/>
+      <w:pPr>
+        <w:tabs>
+          <w:tab w:val="num" w:pos="6480"/>
+        </w:tabs>
+        <w:ind w:left="6480" w:hanging="360"/>
+      </w:pPr>
+      <w:rPr>
+        <w:rFonts w:ascii="Wingdings" w:hAnsi="Wingdings" w:hint="default"/>
+        <w:sz w:val="20"/>
+      </w:rPr>
+    </w:lvl>
+  </w:abstractNum>
+  <w:abstractNum w:abstractNumId="5" w15:restartNumberingAfterBreak="0">
     <w:nsid w:val="0F7D6237"/>
     <w:multiLevelType w:val="hybridMultilevel"/>
     <w:tmpl w:val="4ED26432"/>
@@ -5390,7 +6079,343 @@
       </w:rPr>
     </w:lvl>
   </w:abstractNum>
-  <w:abstractNum w:abstractNumId="3" w15:restartNumberingAfterBreak="0">
+  <w:abstractNum w:abstractNumId="6" w15:restartNumberingAfterBreak="0">
+    <w:nsid w:val="1064753E"/>
+    <w:multiLevelType w:val="hybridMultilevel"/>
+    <w:tmpl w:val="5986C7DE"/>
+    <w:lvl w:ilvl="0" w:tplc="77662248">
+      <w:numFmt w:val="bullet"/>
+      <w:lvlText w:val="•"/>
+      <w:lvlJc w:val="left"/>
+      <w:pPr>
+        <w:ind w:left="1780" w:hanging="360"/>
+      </w:pPr>
+      <w:rPr>
+        <w:rFonts w:ascii="Times New Roman" w:eastAsia="Arial" w:hAnsi="Times New Roman" w:cs="Times New Roman" w:hint="default"/>
+      </w:rPr>
+    </w:lvl>
+    <w:lvl w:ilvl="1" w:tplc="40090003" w:tentative="1">
+      <w:start w:val="1"/>
+      <w:numFmt w:val="bullet"/>
+      <w:lvlText w:val="o"/>
+      <w:lvlJc w:val="left"/>
+      <w:pPr>
+        <w:ind w:left="2150" w:hanging="360"/>
+      </w:pPr>
+      <w:rPr>
+        <w:rFonts w:ascii="Courier New" w:hAnsi="Courier New" w:cs="Courier New" w:hint="default"/>
+      </w:rPr>
+    </w:lvl>
+    <w:lvl w:ilvl="2" w:tplc="40090005" w:tentative="1">
+      <w:start w:val="1"/>
+      <w:numFmt w:val="bullet"/>
+      <w:lvlText w:val=""/>
+      <w:lvlJc w:val="left"/>
+      <w:pPr>
+        <w:ind w:left="2870" w:hanging="360"/>
+      </w:pPr>
+      <w:rPr>
+        <w:rFonts w:ascii="Wingdings" w:hAnsi="Wingdings" w:hint="default"/>
+      </w:rPr>
+    </w:lvl>
+    <w:lvl w:ilvl="3" w:tplc="40090001" w:tentative="1">
+      <w:start w:val="1"/>
+      <w:numFmt w:val="bullet"/>
+      <w:lvlText w:val=""/>
+      <w:lvlJc w:val="left"/>
+      <w:pPr>
+        <w:ind w:left="3590" w:hanging="360"/>
+      </w:pPr>
+      <w:rPr>
+        <w:rFonts w:ascii="Symbol" w:hAnsi="Symbol" w:hint="default"/>
+      </w:rPr>
+    </w:lvl>
+    <w:lvl w:ilvl="4" w:tplc="40090003" w:tentative="1">
+      <w:start w:val="1"/>
+      <w:numFmt w:val="bullet"/>
+      <w:lvlText w:val="o"/>
+      <w:lvlJc w:val="left"/>
+      <w:pPr>
+        <w:ind w:left="4310" w:hanging="360"/>
+      </w:pPr>
+      <w:rPr>
+        <w:rFonts w:ascii="Courier New" w:hAnsi="Courier New" w:cs="Courier New" w:hint="default"/>
+      </w:rPr>
+    </w:lvl>
+    <w:lvl w:ilvl="5" w:tplc="40090005" w:tentative="1">
+      <w:start w:val="1"/>
+      <w:numFmt w:val="bullet"/>
+      <w:lvlText w:val=""/>
+      <w:lvlJc w:val="left"/>
+      <w:pPr>
+        <w:ind w:left="5030" w:hanging="360"/>
+      </w:pPr>
+      <w:rPr>
+        <w:rFonts w:ascii="Wingdings" w:hAnsi="Wingdings" w:hint="default"/>
+      </w:rPr>
+    </w:lvl>
+    <w:lvl w:ilvl="6" w:tplc="40090001" w:tentative="1">
+      <w:start w:val="1"/>
+      <w:numFmt w:val="bullet"/>
+      <w:lvlText w:val=""/>
+      <w:lvlJc w:val="left"/>
+      <w:pPr>
+        <w:ind w:left="5750" w:hanging="360"/>
+      </w:pPr>
+      <w:rPr>
+        <w:rFonts w:ascii="Symbol" w:hAnsi="Symbol" w:hint="default"/>
+      </w:rPr>
+    </w:lvl>
+    <w:lvl w:ilvl="7" w:tplc="40090003" w:tentative="1">
+      <w:start w:val="1"/>
+      <w:numFmt w:val="bullet"/>
+      <w:lvlText w:val="o"/>
+      <w:lvlJc w:val="left"/>
+      <w:pPr>
+        <w:ind w:left="6470" w:hanging="360"/>
+      </w:pPr>
+      <w:rPr>
+        <w:rFonts w:ascii="Courier New" w:hAnsi="Courier New" w:cs="Courier New" w:hint="default"/>
+      </w:rPr>
+    </w:lvl>
+    <w:lvl w:ilvl="8" w:tplc="40090005" w:tentative="1">
+      <w:start w:val="1"/>
+      <w:numFmt w:val="bullet"/>
+      <w:lvlText w:val=""/>
+      <w:lvlJc w:val="left"/>
+      <w:pPr>
+        <w:ind w:left="7190" w:hanging="360"/>
+      </w:pPr>
+      <w:rPr>
+        <w:rFonts w:ascii="Wingdings" w:hAnsi="Wingdings" w:hint="default"/>
+      </w:rPr>
+    </w:lvl>
+  </w:abstractNum>
+  <w:abstractNum w:abstractNumId="7" w15:restartNumberingAfterBreak="0">
+    <w:nsid w:val="117B4C6D"/>
+    <w:multiLevelType w:val="hybridMultilevel"/>
+    <w:tmpl w:val="6526D88A"/>
+    <w:lvl w:ilvl="0" w:tplc="77662248">
+      <w:numFmt w:val="bullet"/>
+      <w:lvlText w:val="•"/>
+      <w:lvlJc w:val="left"/>
+      <w:pPr>
+        <w:ind w:left="1780" w:hanging="360"/>
+      </w:pPr>
+      <w:rPr>
+        <w:rFonts w:ascii="Times New Roman" w:eastAsia="Arial" w:hAnsi="Times New Roman" w:cs="Times New Roman" w:hint="default"/>
+      </w:rPr>
+    </w:lvl>
+    <w:lvl w:ilvl="1" w:tplc="40090003" w:tentative="1">
+      <w:start w:val="1"/>
+      <w:numFmt w:val="bullet"/>
+      <w:lvlText w:val="o"/>
+      <w:lvlJc w:val="left"/>
+      <w:pPr>
+        <w:ind w:left="2150" w:hanging="360"/>
+      </w:pPr>
+      <w:rPr>
+        <w:rFonts w:ascii="Courier New" w:hAnsi="Courier New" w:cs="Courier New" w:hint="default"/>
+      </w:rPr>
+    </w:lvl>
+    <w:lvl w:ilvl="2" w:tplc="40090005" w:tentative="1">
+      <w:start w:val="1"/>
+      <w:numFmt w:val="bullet"/>
+      <w:lvlText w:val=""/>
+      <w:lvlJc w:val="left"/>
+      <w:pPr>
+        <w:ind w:left="2870" w:hanging="360"/>
+      </w:pPr>
+      <w:rPr>
+        <w:rFonts w:ascii="Wingdings" w:hAnsi="Wingdings" w:hint="default"/>
+      </w:rPr>
+    </w:lvl>
+    <w:lvl w:ilvl="3" w:tplc="40090001" w:tentative="1">
+      <w:start w:val="1"/>
+      <w:numFmt w:val="bullet"/>
+      <w:lvlText w:val=""/>
+      <w:lvlJc w:val="left"/>
+      <w:pPr>
+        <w:ind w:left="3590" w:hanging="360"/>
+      </w:pPr>
+      <w:rPr>
+        <w:rFonts w:ascii="Symbol" w:hAnsi="Symbol" w:hint="default"/>
+      </w:rPr>
+    </w:lvl>
+    <w:lvl w:ilvl="4" w:tplc="40090003" w:tentative="1">
+      <w:start w:val="1"/>
+      <w:numFmt w:val="bullet"/>
+      <w:lvlText w:val="o"/>
+      <w:lvlJc w:val="left"/>
+      <w:pPr>
+        <w:ind w:left="4310" w:hanging="360"/>
+      </w:pPr>
+      <w:rPr>
+        <w:rFonts w:ascii="Courier New" w:hAnsi="Courier New" w:cs="Courier New" w:hint="default"/>
+      </w:rPr>
+    </w:lvl>
+    <w:lvl w:ilvl="5" w:tplc="40090005" w:tentative="1">
+      <w:start w:val="1"/>
+      <w:numFmt w:val="bullet"/>
+      <w:lvlText w:val=""/>
+      <w:lvlJc w:val="left"/>
+      <w:pPr>
+        <w:ind w:left="5030" w:hanging="360"/>
+      </w:pPr>
+      <w:rPr>
+        <w:rFonts w:ascii="Wingdings" w:hAnsi="Wingdings" w:hint="default"/>
+      </w:rPr>
+    </w:lvl>
+    <w:lvl w:ilvl="6" w:tplc="40090001" w:tentative="1">
+      <w:start w:val="1"/>
+      <w:numFmt w:val="bullet"/>
+      <w:lvlText w:val=""/>
+      <w:lvlJc w:val="left"/>
+      <w:pPr>
+        <w:ind w:left="5750" w:hanging="360"/>
+      </w:pPr>
+      <w:rPr>
+        <w:rFonts w:ascii="Symbol" w:hAnsi="Symbol" w:hint="default"/>
+      </w:rPr>
+    </w:lvl>
+    <w:lvl w:ilvl="7" w:tplc="40090003" w:tentative="1">
+      <w:start w:val="1"/>
+      <w:numFmt w:val="bullet"/>
+      <w:lvlText w:val="o"/>
+      <w:lvlJc w:val="left"/>
+      <w:pPr>
+        <w:ind w:left="6470" w:hanging="360"/>
+      </w:pPr>
+      <w:rPr>
+        <w:rFonts w:ascii="Courier New" w:hAnsi="Courier New" w:cs="Courier New" w:hint="default"/>
+      </w:rPr>
+    </w:lvl>
+    <w:lvl w:ilvl="8" w:tplc="40090005" w:tentative="1">
+      <w:start w:val="1"/>
+      <w:numFmt w:val="bullet"/>
+      <w:lvlText w:val=""/>
+      <w:lvlJc w:val="left"/>
+      <w:pPr>
+        <w:ind w:left="7190" w:hanging="360"/>
+      </w:pPr>
+      <w:rPr>
+        <w:rFonts w:ascii="Wingdings" w:hAnsi="Wingdings" w:hint="default"/>
+      </w:rPr>
+    </w:lvl>
+  </w:abstractNum>
+  <w:abstractNum w:abstractNumId="8" w15:restartNumberingAfterBreak="0">
+    <w:nsid w:val="123530ED"/>
+    <w:multiLevelType w:val="hybridMultilevel"/>
+    <w:tmpl w:val="5BAC4ACE"/>
+    <w:lvl w:ilvl="0" w:tplc="77662248">
+      <w:numFmt w:val="bullet"/>
+      <w:lvlText w:val="•"/>
+      <w:lvlJc w:val="left"/>
+      <w:pPr>
+        <w:ind w:left="1780" w:hanging="360"/>
+      </w:pPr>
+      <w:rPr>
+        <w:rFonts w:ascii="Times New Roman" w:eastAsia="Arial" w:hAnsi="Times New Roman" w:cs="Times New Roman" w:hint="default"/>
+      </w:rPr>
+    </w:lvl>
+    <w:lvl w:ilvl="1" w:tplc="40090003" w:tentative="1">
+      <w:start w:val="1"/>
+      <w:numFmt w:val="bullet"/>
+      <w:lvlText w:val="o"/>
+      <w:lvlJc w:val="left"/>
+      <w:pPr>
+        <w:ind w:left="2150" w:hanging="360"/>
+      </w:pPr>
+      <w:rPr>
+        <w:rFonts w:ascii="Courier New" w:hAnsi="Courier New" w:cs="Courier New" w:hint="default"/>
+      </w:rPr>
+    </w:lvl>
+    <w:lvl w:ilvl="2" w:tplc="40090005" w:tentative="1">
+      <w:start w:val="1"/>
+      <w:numFmt w:val="bullet"/>
+      <w:lvlText w:val=""/>
+      <w:lvlJc w:val="left"/>
+      <w:pPr>
+        <w:ind w:left="2870" w:hanging="360"/>
+      </w:pPr>
+      <w:rPr>
+        <w:rFonts w:ascii="Wingdings" w:hAnsi="Wingdings" w:hint="default"/>
+      </w:rPr>
+    </w:lvl>
+    <w:lvl w:ilvl="3" w:tplc="40090001" w:tentative="1">
+      <w:start w:val="1"/>
+      <w:numFmt w:val="bullet"/>
+      <w:lvlText w:val=""/>
+      <w:lvlJc w:val="left"/>
+      <w:pPr>
+        <w:ind w:left="3590" w:hanging="360"/>
+      </w:pPr>
+      <w:rPr>
+        <w:rFonts w:ascii="Symbol" w:hAnsi="Symbol" w:hint="default"/>
+      </w:rPr>
+    </w:lvl>
+    <w:lvl w:ilvl="4" w:tplc="40090003" w:tentative="1">
+      <w:start w:val="1"/>
+      <w:numFmt w:val="bullet"/>
+      <w:lvlText w:val="o"/>
+      <w:lvlJc w:val="left"/>
+      <w:pPr>
+        <w:ind w:left="4310" w:hanging="360"/>
+      </w:pPr>
+      <w:rPr>
+        <w:rFonts w:ascii="Courier New" w:hAnsi="Courier New" w:cs="Courier New" w:hint="default"/>
+      </w:rPr>
+    </w:lvl>
+    <w:lvl w:ilvl="5" w:tplc="40090005" w:tentative="1">
+      <w:start w:val="1"/>
+      <w:numFmt w:val="bullet"/>
+      <w:lvlText w:val=""/>
+      <w:lvlJc w:val="left"/>
+      <w:pPr>
+        <w:ind w:left="5030" w:hanging="360"/>
+      </w:pPr>
+      <w:rPr>
+        <w:rFonts w:ascii="Wingdings" w:hAnsi="Wingdings" w:hint="default"/>
+      </w:rPr>
+    </w:lvl>
+    <w:lvl w:ilvl="6" w:tplc="40090001" w:tentative="1">
+      <w:start w:val="1"/>
+      <w:numFmt w:val="bullet"/>
+      <w:lvlText w:val=""/>
+      <w:lvlJc w:val="left"/>
+      <w:pPr>
+        <w:ind w:left="5750" w:hanging="360"/>
+      </w:pPr>
+      <w:rPr>
+        <w:rFonts w:ascii="Symbol" w:hAnsi="Symbol" w:hint="default"/>
+      </w:rPr>
+    </w:lvl>
+    <w:lvl w:ilvl="7" w:tplc="40090003" w:tentative="1">
+      <w:start w:val="1"/>
+      <w:numFmt w:val="bullet"/>
+      <w:lvlText w:val="o"/>
+      <w:lvlJc w:val="left"/>
+      <w:pPr>
+        <w:ind w:left="6470" w:hanging="360"/>
+      </w:pPr>
+      <w:rPr>
+        <w:rFonts w:ascii="Courier New" w:hAnsi="Courier New" w:cs="Courier New" w:hint="default"/>
+      </w:rPr>
+    </w:lvl>
+    <w:lvl w:ilvl="8" w:tplc="40090005" w:tentative="1">
+      <w:start w:val="1"/>
+      <w:numFmt w:val="bullet"/>
+      <w:lvlText w:val=""/>
+      <w:lvlJc w:val="left"/>
+      <w:pPr>
+        <w:ind w:left="7190" w:hanging="360"/>
+      </w:pPr>
+      <w:rPr>
+        <w:rFonts w:ascii="Wingdings" w:hAnsi="Wingdings" w:hint="default"/>
+      </w:rPr>
+    </w:lvl>
+  </w:abstractNum>
+  <w:abstractNum w:abstractNumId="9" w15:restartNumberingAfterBreak="0">
     <w:nsid w:val="15F46651"/>
     <w:multiLevelType w:val="multilevel"/>
     <w:tmpl w:val="5A5AAEC2"/>
@@ -5539,7 +6564,7 @@
       </w:rPr>
     </w:lvl>
   </w:abstractNum>
-  <w:abstractNum w:abstractNumId="4" w15:restartNumberingAfterBreak="0">
+  <w:abstractNum w:abstractNumId="10" w15:restartNumberingAfterBreak="0">
     <w:nsid w:val="164506B4"/>
     <w:multiLevelType w:val="hybridMultilevel"/>
     <w:tmpl w:val="9FB8EFFE"/>
@@ -5652,7 +6677,7 @@
       </w:rPr>
     </w:lvl>
   </w:abstractNum>
-  <w:abstractNum w:abstractNumId="5" w15:restartNumberingAfterBreak="0">
+  <w:abstractNum w:abstractNumId="11" w15:restartNumberingAfterBreak="0">
     <w:nsid w:val="16915C75"/>
     <w:multiLevelType w:val="hybridMultilevel"/>
     <w:tmpl w:val="8B68B0B0"/>
@@ -5765,7 +6790,7 @@
       </w:rPr>
     </w:lvl>
   </w:abstractNum>
-  <w:abstractNum w:abstractNumId="6" w15:restartNumberingAfterBreak="0">
+  <w:abstractNum w:abstractNumId="12" w15:restartNumberingAfterBreak="0">
     <w:nsid w:val="1730441F"/>
     <w:multiLevelType w:val="hybridMultilevel"/>
     <w:tmpl w:val="41CCAD06"/>
@@ -5878,7 +6903,119 @@
       </w:rPr>
     </w:lvl>
   </w:abstractNum>
-  <w:abstractNum w:abstractNumId="7" w15:restartNumberingAfterBreak="0">
+  <w:abstractNum w:abstractNumId="13" w15:restartNumberingAfterBreak="0">
+    <w:nsid w:val="184A0FCB"/>
+    <w:multiLevelType w:val="hybridMultilevel"/>
+    <w:tmpl w:val="963267E2"/>
+    <w:lvl w:ilvl="0" w:tplc="77662248">
+      <w:numFmt w:val="bullet"/>
+      <w:lvlText w:val="•"/>
+      <w:lvlJc w:val="left"/>
+      <w:pPr>
+        <w:ind w:left="1070" w:hanging="360"/>
+      </w:pPr>
+      <w:rPr>
+        <w:rFonts w:ascii="Times New Roman" w:eastAsia="Arial" w:hAnsi="Times New Roman" w:cs="Times New Roman" w:hint="default"/>
+      </w:rPr>
+    </w:lvl>
+    <w:lvl w:ilvl="1" w:tplc="40090003" w:tentative="1">
+      <w:start w:val="1"/>
+      <w:numFmt w:val="bullet"/>
+      <w:lvlText w:val="o"/>
+      <w:lvlJc w:val="left"/>
+      <w:pPr>
+        <w:ind w:left="1790" w:hanging="360"/>
+      </w:pPr>
+      <w:rPr>
+        <w:rFonts w:ascii="Courier New" w:hAnsi="Courier New" w:cs="Courier New" w:hint="default"/>
+      </w:rPr>
+    </w:lvl>
+    <w:lvl w:ilvl="2" w:tplc="40090005" w:tentative="1">
+      <w:start w:val="1"/>
+      <w:numFmt w:val="bullet"/>
+      <w:lvlText w:val=""/>
+      <w:lvlJc w:val="left"/>
+      <w:pPr>
+        <w:ind w:left="2510" w:hanging="360"/>
+      </w:pPr>
+      <w:rPr>
+        <w:rFonts w:ascii="Wingdings" w:hAnsi="Wingdings" w:hint="default"/>
+      </w:rPr>
+    </w:lvl>
+    <w:lvl w:ilvl="3" w:tplc="40090001" w:tentative="1">
+      <w:start w:val="1"/>
+      <w:numFmt w:val="bullet"/>
+      <w:lvlText w:val=""/>
+      <w:lvlJc w:val="left"/>
+      <w:pPr>
+        <w:ind w:left="3230" w:hanging="360"/>
+      </w:pPr>
+      <w:rPr>
+        <w:rFonts w:ascii="Symbol" w:hAnsi="Symbol" w:hint="default"/>
+      </w:rPr>
+    </w:lvl>
+    <w:lvl w:ilvl="4" w:tplc="40090003" w:tentative="1">
+      <w:start w:val="1"/>
+      <w:numFmt w:val="bullet"/>
+      <w:lvlText w:val="o"/>
+      <w:lvlJc w:val="left"/>
+      <w:pPr>
+        <w:ind w:left="3950" w:hanging="360"/>
+      </w:pPr>
+      <w:rPr>
+        <w:rFonts w:ascii="Courier New" w:hAnsi="Courier New" w:cs="Courier New" w:hint="default"/>
+      </w:rPr>
+    </w:lvl>
+    <w:lvl w:ilvl="5" w:tplc="40090005" w:tentative="1">
+      <w:start w:val="1"/>
+      <w:numFmt w:val="bullet"/>
+      <w:lvlText w:val=""/>
+      <w:lvlJc w:val="left"/>
+      <w:pPr>
+        <w:ind w:left="4670" w:hanging="360"/>
+      </w:pPr>
+      <w:rPr>
+        <w:rFonts w:ascii="Wingdings" w:hAnsi="Wingdings" w:hint="default"/>
+      </w:rPr>
+    </w:lvl>
+    <w:lvl w:ilvl="6" w:tplc="40090001" w:tentative="1">
+      <w:start w:val="1"/>
+      <w:numFmt w:val="bullet"/>
+      <w:lvlText w:val=""/>
+      <w:lvlJc w:val="left"/>
+      <w:pPr>
+        <w:ind w:left="5390" w:hanging="360"/>
+      </w:pPr>
+      <w:rPr>
+        <w:rFonts w:ascii="Symbol" w:hAnsi="Symbol" w:hint="default"/>
+      </w:rPr>
+    </w:lvl>
+    <w:lvl w:ilvl="7" w:tplc="40090003" w:tentative="1">
+      <w:start w:val="1"/>
+      <w:numFmt w:val="bullet"/>
+      <w:lvlText w:val="o"/>
+      <w:lvlJc w:val="left"/>
+      <w:pPr>
+        <w:ind w:left="6110" w:hanging="360"/>
+      </w:pPr>
+      <w:rPr>
+        <w:rFonts w:ascii="Courier New" w:hAnsi="Courier New" w:cs="Courier New" w:hint="default"/>
+      </w:rPr>
+    </w:lvl>
+    <w:lvl w:ilvl="8" w:tplc="40090005" w:tentative="1">
+      <w:start w:val="1"/>
+      <w:numFmt w:val="bullet"/>
+      <w:lvlText w:val=""/>
+      <w:lvlJc w:val="left"/>
+      <w:pPr>
+        <w:ind w:left="6830" w:hanging="360"/>
+      </w:pPr>
+      <w:rPr>
+        <w:rFonts w:ascii="Wingdings" w:hAnsi="Wingdings" w:hint="default"/>
+      </w:rPr>
+    </w:lvl>
+  </w:abstractNum>
+  <w:abstractNum w:abstractNumId="14" w15:restartNumberingAfterBreak="0">
     <w:nsid w:val="1BE604EC"/>
     <w:multiLevelType w:val="hybridMultilevel"/>
     <w:tmpl w:val="0DD29E24"/>
@@ -5991,7 +7128,7 @@
       </w:rPr>
     </w:lvl>
   </w:abstractNum>
-  <w:abstractNum w:abstractNumId="8" w15:restartNumberingAfterBreak="0">
+  <w:abstractNum w:abstractNumId="15" w15:restartNumberingAfterBreak="0">
     <w:nsid w:val="1E445806"/>
     <w:multiLevelType w:val="hybridMultilevel"/>
     <w:tmpl w:val="4E3CE7A8"/>
@@ -6104,7 +7241,7 @@
       </w:rPr>
     </w:lvl>
   </w:abstractNum>
-  <w:abstractNum w:abstractNumId="9" w15:restartNumberingAfterBreak="0">
+  <w:abstractNum w:abstractNumId="16" w15:restartNumberingAfterBreak="0">
     <w:nsid w:val="23A818A4"/>
     <w:multiLevelType w:val="multilevel"/>
     <w:tmpl w:val="9BC421D6"/>
@@ -6253,7 +7390,7 @@
       </w:rPr>
     </w:lvl>
   </w:abstractNum>
-  <w:abstractNum w:abstractNumId="10" w15:restartNumberingAfterBreak="0">
+  <w:abstractNum w:abstractNumId="17" w15:restartNumberingAfterBreak="0">
     <w:nsid w:val="247F4F57"/>
     <w:multiLevelType w:val="multilevel"/>
     <w:tmpl w:val="5A5AAEC2"/>
@@ -6402,7 +7539,7 @@
       </w:rPr>
     </w:lvl>
   </w:abstractNum>
-  <w:abstractNum w:abstractNumId="11" w15:restartNumberingAfterBreak="0">
+  <w:abstractNum w:abstractNumId="18" w15:restartNumberingAfterBreak="0">
     <w:nsid w:val="24D37CB6"/>
     <w:multiLevelType w:val="hybridMultilevel"/>
     <w:tmpl w:val="5E0A33C2"/>
@@ -6515,7 +7652,7 @@
       </w:rPr>
     </w:lvl>
   </w:abstractNum>
-  <w:abstractNum w:abstractNumId="12" w15:restartNumberingAfterBreak="0">
+  <w:abstractNum w:abstractNumId="19" w15:restartNumberingAfterBreak="0">
     <w:nsid w:val="2E0A6AE5"/>
     <w:multiLevelType w:val="hybridMultilevel"/>
     <w:tmpl w:val="1E60B4D4"/>
@@ -6628,7 +7765,7 @@
       </w:rPr>
     </w:lvl>
   </w:abstractNum>
-  <w:abstractNum w:abstractNumId="13" w15:restartNumberingAfterBreak="0">
+  <w:abstractNum w:abstractNumId="20" w15:restartNumberingAfterBreak="0">
     <w:nsid w:val="2ED02F80"/>
     <w:multiLevelType w:val="hybridMultilevel"/>
     <w:tmpl w:val="F8D820A2"/>
@@ -6741,7 +7878,231 @@
       </w:rPr>
     </w:lvl>
   </w:abstractNum>
-  <w:abstractNum w:abstractNumId="14" w15:restartNumberingAfterBreak="0">
+  <w:abstractNum w:abstractNumId="21" w15:restartNumberingAfterBreak="0">
+    <w:nsid w:val="2ED2745E"/>
+    <w:multiLevelType w:val="hybridMultilevel"/>
+    <w:tmpl w:val="2872ECEA"/>
+    <w:lvl w:ilvl="0" w:tplc="77662248">
+      <w:numFmt w:val="bullet"/>
+      <w:lvlText w:val="•"/>
+      <w:lvlJc w:val="left"/>
+      <w:pPr>
+        <w:ind w:left="1780" w:hanging="360"/>
+      </w:pPr>
+      <w:rPr>
+        <w:rFonts w:ascii="Times New Roman" w:eastAsia="Arial" w:hAnsi="Times New Roman" w:cs="Times New Roman" w:hint="default"/>
+      </w:rPr>
+    </w:lvl>
+    <w:lvl w:ilvl="1" w:tplc="40090003" w:tentative="1">
+      <w:start w:val="1"/>
+      <w:numFmt w:val="bullet"/>
+      <w:lvlText w:val="o"/>
+      <w:lvlJc w:val="left"/>
+      <w:pPr>
+        <w:ind w:left="2150" w:hanging="360"/>
+      </w:pPr>
+      <w:rPr>
+        <w:rFonts w:ascii="Courier New" w:hAnsi="Courier New" w:cs="Courier New" w:hint="default"/>
+      </w:rPr>
+    </w:lvl>
+    <w:lvl w:ilvl="2" w:tplc="40090005" w:tentative="1">
+      <w:start w:val="1"/>
+      <w:numFmt w:val="bullet"/>
+      <w:lvlText w:val=""/>
+      <w:lvlJc w:val="left"/>
+      <w:pPr>
+        <w:ind w:left="2870" w:hanging="360"/>
+      </w:pPr>
+      <w:rPr>
+        <w:rFonts w:ascii="Wingdings" w:hAnsi="Wingdings" w:hint="default"/>
+      </w:rPr>
+    </w:lvl>
+    <w:lvl w:ilvl="3" w:tplc="40090001" w:tentative="1">
+      <w:start w:val="1"/>
+      <w:numFmt w:val="bullet"/>
+      <w:lvlText w:val=""/>
+      <w:lvlJc w:val="left"/>
+      <w:pPr>
+        <w:ind w:left="3590" w:hanging="360"/>
+      </w:pPr>
+      <w:rPr>
+        <w:rFonts w:ascii="Symbol" w:hAnsi="Symbol" w:hint="default"/>
+      </w:rPr>
+    </w:lvl>
+    <w:lvl w:ilvl="4" w:tplc="40090003" w:tentative="1">
+      <w:start w:val="1"/>
+      <w:numFmt w:val="bullet"/>
+      <w:lvlText w:val="o"/>
+      <w:lvlJc w:val="left"/>
+      <w:pPr>
+        <w:ind w:left="4310" w:hanging="360"/>
+      </w:pPr>
+      <w:rPr>
+        <w:rFonts w:ascii="Courier New" w:hAnsi="Courier New" w:cs="Courier New" w:hint="default"/>
+      </w:rPr>
+    </w:lvl>
+    <w:lvl w:ilvl="5" w:tplc="40090005" w:tentative="1">
+      <w:start w:val="1"/>
+      <w:numFmt w:val="bullet"/>
+      <w:lvlText w:val=""/>
+      <w:lvlJc w:val="left"/>
+      <w:pPr>
+        <w:ind w:left="5030" w:hanging="360"/>
+      </w:pPr>
+      <w:rPr>
+        <w:rFonts w:ascii="Wingdings" w:hAnsi="Wingdings" w:hint="default"/>
+      </w:rPr>
+    </w:lvl>
+    <w:lvl w:ilvl="6" w:tplc="40090001" w:tentative="1">
+      <w:start w:val="1"/>
+      <w:numFmt w:val="bullet"/>
+      <w:lvlText w:val=""/>
+      <w:lvlJc w:val="left"/>
+      <w:pPr>
+        <w:ind w:left="5750" w:hanging="360"/>
+      </w:pPr>
+      <w:rPr>
+        <w:rFonts w:ascii="Symbol" w:hAnsi="Symbol" w:hint="default"/>
+      </w:rPr>
+    </w:lvl>
+    <w:lvl w:ilvl="7" w:tplc="40090003" w:tentative="1">
+      <w:start w:val="1"/>
+      <w:numFmt w:val="bullet"/>
+      <w:lvlText w:val="o"/>
+      <w:lvlJc w:val="left"/>
+      <w:pPr>
+        <w:ind w:left="6470" w:hanging="360"/>
+      </w:pPr>
+      <w:rPr>
+        <w:rFonts w:ascii="Courier New" w:hAnsi="Courier New" w:cs="Courier New" w:hint="default"/>
+      </w:rPr>
+    </w:lvl>
+    <w:lvl w:ilvl="8" w:tplc="40090005" w:tentative="1">
+      <w:start w:val="1"/>
+      <w:numFmt w:val="bullet"/>
+      <w:lvlText w:val=""/>
+      <w:lvlJc w:val="left"/>
+      <w:pPr>
+        <w:ind w:left="7190" w:hanging="360"/>
+      </w:pPr>
+      <w:rPr>
+        <w:rFonts w:ascii="Wingdings" w:hAnsi="Wingdings" w:hint="default"/>
+      </w:rPr>
+    </w:lvl>
+  </w:abstractNum>
+  <w:abstractNum w:abstractNumId="22" w15:restartNumberingAfterBreak="0">
+    <w:nsid w:val="35CF1205"/>
+    <w:multiLevelType w:val="hybridMultilevel"/>
+    <w:tmpl w:val="ED765E72"/>
+    <w:lvl w:ilvl="0" w:tplc="77662248">
+      <w:numFmt w:val="bullet"/>
+      <w:lvlText w:val="•"/>
+      <w:lvlJc w:val="left"/>
+      <w:pPr>
+        <w:ind w:left="1070" w:hanging="360"/>
+      </w:pPr>
+      <w:rPr>
+        <w:rFonts w:ascii="Times New Roman" w:eastAsia="Arial" w:hAnsi="Times New Roman" w:cs="Times New Roman" w:hint="default"/>
+      </w:rPr>
+    </w:lvl>
+    <w:lvl w:ilvl="1" w:tplc="40090003" w:tentative="1">
+      <w:start w:val="1"/>
+      <w:numFmt w:val="bullet"/>
+      <w:lvlText w:val="o"/>
+      <w:lvlJc w:val="left"/>
+      <w:pPr>
+        <w:ind w:left="1440" w:hanging="360"/>
+      </w:pPr>
+      <w:rPr>
+        <w:rFonts w:ascii="Courier New" w:hAnsi="Courier New" w:cs="Courier New" w:hint="default"/>
+      </w:rPr>
+    </w:lvl>
+    <w:lvl w:ilvl="2" w:tplc="40090005" w:tentative="1">
+      <w:start w:val="1"/>
+      <w:numFmt w:val="bullet"/>
+      <w:lvlText w:val=""/>
+      <w:lvlJc w:val="left"/>
+      <w:pPr>
+        <w:ind w:left="2160" w:hanging="360"/>
+      </w:pPr>
+      <w:rPr>
+        <w:rFonts w:ascii="Wingdings" w:hAnsi="Wingdings" w:hint="default"/>
+      </w:rPr>
+    </w:lvl>
+    <w:lvl w:ilvl="3" w:tplc="40090001" w:tentative="1">
+      <w:start w:val="1"/>
+      <w:numFmt w:val="bullet"/>
+      <w:lvlText w:val=""/>
+      <w:lvlJc w:val="left"/>
+      <w:pPr>
+        <w:ind w:left="2880" w:hanging="360"/>
+      </w:pPr>
+      <w:rPr>
+        <w:rFonts w:ascii="Symbol" w:hAnsi="Symbol" w:hint="default"/>
+      </w:rPr>
+    </w:lvl>
+    <w:lvl w:ilvl="4" w:tplc="40090003" w:tentative="1">
+      <w:start w:val="1"/>
+      <w:numFmt w:val="bullet"/>
+      <w:lvlText w:val="o"/>
+      <w:lvlJc w:val="left"/>
+      <w:pPr>
+        <w:ind w:left="3600" w:hanging="360"/>
+      </w:pPr>
+      <w:rPr>
+        <w:rFonts w:ascii="Courier New" w:hAnsi="Courier New" w:cs="Courier New" w:hint="default"/>
+      </w:rPr>
+    </w:lvl>
+    <w:lvl w:ilvl="5" w:tplc="40090005" w:tentative="1">
+      <w:start w:val="1"/>
+      <w:numFmt w:val="bullet"/>
+      <w:lvlText w:val=""/>
+      <w:lvlJc w:val="left"/>
+      <w:pPr>
+        <w:ind w:left="4320" w:hanging="360"/>
+      </w:pPr>
+      <w:rPr>
+        <w:rFonts w:ascii="Wingdings" w:hAnsi="Wingdings" w:hint="default"/>
+      </w:rPr>
+    </w:lvl>
+    <w:lvl w:ilvl="6" w:tplc="40090001" w:tentative="1">
+      <w:start w:val="1"/>
+      <w:numFmt w:val="bullet"/>
+      <w:lvlText w:val=""/>
+      <w:lvlJc w:val="left"/>
+      <w:pPr>
+        <w:ind w:left="5040" w:hanging="360"/>
+      </w:pPr>
+      <w:rPr>
+        <w:rFonts w:ascii="Symbol" w:hAnsi="Symbol" w:hint="default"/>
+      </w:rPr>
+    </w:lvl>
+    <w:lvl w:ilvl="7" w:tplc="40090003" w:tentative="1">
+      <w:start w:val="1"/>
+      <w:numFmt w:val="bullet"/>
+      <w:lvlText w:val="o"/>
+      <w:lvlJc w:val="left"/>
+      <w:pPr>
+        <w:ind w:left="5760" w:hanging="360"/>
+      </w:pPr>
+      <w:rPr>
+        <w:rFonts w:ascii="Courier New" w:hAnsi="Courier New" w:cs="Courier New" w:hint="default"/>
+      </w:rPr>
+    </w:lvl>
+    <w:lvl w:ilvl="8" w:tplc="40090005" w:tentative="1">
+      <w:start w:val="1"/>
+      <w:numFmt w:val="bullet"/>
+      <w:lvlText w:val=""/>
+      <w:lvlJc w:val="left"/>
+      <w:pPr>
+        <w:ind w:left="6480" w:hanging="360"/>
+      </w:pPr>
+      <w:rPr>
+        <w:rFonts w:ascii="Wingdings" w:hAnsi="Wingdings" w:hint="default"/>
+      </w:rPr>
+    </w:lvl>
+  </w:abstractNum>
+  <w:abstractNum w:abstractNumId="23" w15:restartNumberingAfterBreak="0">
     <w:nsid w:val="364C5305"/>
     <w:multiLevelType w:val="hybridMultilevel"/>
     <w:tmpl w:val="543E3C50"/>
@@ -6854,7 +8215,7 @@
       </w:rPr>
     </w:lvl>
   </w:abstractNum>
-  <w:abstractNum w:abstractNumId="15" w15:restartNumberingAfterBreak="0">
+  <w:abstractNum w:abstractNumId="24" w15:restartNumberingAfterBreak="0">
     <w:nsid w:val="3AF33D7A"/>
     <w:multiLevelType w:val="hybridMultilevel"/>
     <w:tmpl w:val="BCEAF5AC"/>
@@ -6966,7 +8327,7 @@
       </w:rPr>
     </w:lvl>
   </w:abstractNum>
-  <w:abstractNum w:abstractNumId="16" w15:restartNumberingAfterBreak="0">
+  <w:abstractNum w:abstractNumId="25" w15:restartNumberingAfterBreak="0">
     <w:nsid w:val="42DF1D40"/>
     <w:multiLevelType w:val="multilevel"/>
     <w:tmpl w:val="ABF2047A"/>
@@ -7115,7 +8476,7 @@
       </w:rPr>
     </w:lvl>
   </w:abstractNum>
-  <w:abstractNum w:abstractNumId="17" w15:restartNumberingAfterBreak="0">
+  <w:abstractNum w:abstractNumId="26" w15:restartNumberingAfterBreak="0">
     <w:nsid w:val="447F017F"/>
     <w:multiLevelType w:val="hybridMultilevel"/>
     <w:tmpl w:val="285A5DF4"/>
@@ -7227,7 +8588,7 @@
       </w:rPr>
     </w:lvl>
   </w:abstractNum>
-  <w:abstractNum w:abstractNumId="18" w15:restartNumberingAfterBreak="0">
+  <w:abstractNum w:abstractNumId="27" w15:restartNumberingAfterBreak="0">
     <w:nsid w:val="47A95FCE"/>
     <w:multiLevelType w:val="hybridMultilevel"/>
     <w:tmpl w:val="71880F82"/>
@@ -7340,7 +8701,7 @@
       </w:rPr>
     </w:lvl>
   </w:abstractNum>
-  <w:abstractNum w:abstractNumId="19" w15:restartNumberingAfterBreak="0">
+  <w:abstractNum w:abstractNumId="28" w15:restartNumberingAfterBreak="0">
     <w:nsid w:val="5AAD6714"/>
     <w:multiLevelType w:val="hybridMultilevel"/>
     <w:tmpl w:val="58C26670"/>
@@ -7426,7 +8787,7 @@
       </w:pPr>
     </w:lvl>
   </w:abstractNum>
-  <w:abstractNum w:abstractNumId="20" w15:restartNumberingAfterBreak="0">
+  <w:abstractNum w:abstractNumId="29" w15:restartNumberingAfterBreak="0">
     <w:nsid w:val="5CA31231"/>
     <w:multiLevelType w:val="hybridMultilevel"/>
     <w:tmpl w:val="850EFE80"/>
@@ -7539,7 +8900,7 @@
       </w:rPr>
     </w:lvl>
   </w:abstractNum>
-  <w:abstractNum w:abstractNumId="21" w15:restartNumberingAfterBreak="0">
+  <w:abstractNum w:abstractNumId="30" w15:restartNumberingAfterBreak="0">
     <w:nsid w:val="673700F7"/>
     <w:multiLevelType w:val="hybridMultilevel"/>
     <w:tmpl w:val="4B8C8C84"/>
@@ -7652,7 +9013,7 @@
       </w:rPr>
     </w:lvl>
   </w:abstractNum>
-  <w:abstractNum w:abstractNumId="22" w15:restartNumberingAfterBreak="0">
+  <w:abstractNum w:abstractNumId="31" w15:restartNumberingAfterBreak="0">
     <w:nsid w:val="69B629D5"/>
     <w:multiLevelType w:val="hybridMultilevel"/>
     <w:tmpl w:val="040CBA46"/>
@@ -7765,7 +9126,7 @@
       </w:rPr>
     </w:lvl>
   </w:abstractNum>
-  <w:abstractNum w:abstractNumId="23" w15:restartNumberingAfterBreak="0">
+  <w:abstractNum w:abstractNumId="32" w15:restartNumberingAfterBreak="0">
     <w:nsid w:val="6AB8507B"/>
     <w:multiLevelType w:val="hybridMultilevel"/>
     <w:tmpl w:val="8F0E7F88"/>
@@ -7878,7 +9239,7 @@
       </w:rPr>
     </w:lvl>
   </w:abstractNum>
-  <w:abstractNum w:abstractNumId="24" w15:restartNumberingAfterBreak="0">
+  <w:abstractNum w:abstractNumId="33" w15:restartNumberingAfterBreak="0">
     <w:nsid w:val="6E61583E"/>
     <w:multiLevelType w:val="hybridMultilevel"/>
     <w:tmpl w:val="0F28EF8E"/>
@@ -7991,7 +9352,7 @@
       </w:rPr>
     </w:lvl>
   </w:abstractNum>
-  <w:abstractNum w:abstractNumId="25" w15:restartNumberingAfterBreak="0">
+  <w:abstractNum w:abstractNumId="34" w15:restartNumberingAfterBreak="0">
     <w:nsid w:val="6F5D0CE8"/>
     <w:multiLevelType w:val="hybridMultilevel"/>
     <w:tmpl w:val="BEE2A010"/>
@@ -8103,7 +9464,7 @@
       </w:rPr>
     </w:lvl>
   </w:abstractNum>
-  <w:abstractNum w:abstractNumId="26" w15:restartNumberingAfterBreak="0">
+  <w:abstractNum w:abstractNumId="35" w15:restartNumberingAfterBreak="0">
     <w:nsid w:val="70007516"/>
     <w:multiLevelType w:val="hybridMultilevel"/>
     <w:tmpl w:val="3B8CC466"/>
@@ -8216,7 +9577,7 @@
       </w:rPr>
     </w:lvl>
   </w:abstractNum>
-  <w:abstractNum w:abstractNumId="27" w15:restartNumberingAfterBreak="0">
+  <w:abstractNum w:abstractNumId="36" w15:restartNumberingAfterBreak="0">
     <w:nsid w:val="73B401FA"/>
     <w:multiLevelType w:val="hybridMultilevel"/>
     <w:tmpl w:val="F094FD06"/>
@@ -8329,7 +9690,7 @@
       </w:rPr>
     </w:lvl>
   </w:abstractNum>
-  <w:abstractNum w:abstractNumId="28" w15:restartNumberingAfterBreak="0">
+  <w:abstractNum w:abstractNumId="37" w15:restartNumberingAfterBreak="0">
     <w:nsid w:val="7D0B6EE6"/>
     <w:multiLevelType w:val="multilevel"/>
     <w:tmpl w:val="5BDA2362"/>
@@ -8443,91 +9804,118 @@
     </w:lvl>
   </w:abstractNum>
   <w:num w:numId="1" w16cid:durableId="326903006">
+    <w:abstractNumId w:val="14"/>
+  </w:num>
+  <w:num w:numId="2" w16cid:durableId="1423454805">
+    <w:abstractNumId w:val="11"/>
+  </w:num>
+  <w:num w:numId="3" w16cid:durableId="1249995567">
+    <w:abstractNumId w:val="19"/>
+  </w:num>
+  <w:num w:numId="4" w16cid:durableId="1318655865">
+    <w:abstractNumId w:val="23"/>
+  </w:num>
+  <w:num w:numId="5" w16cid:durableId="1364405303">
+    <w:abstractNumId w:val="31"/>
+  </w:num>
+  <w:num w:numId="6" w16cid:durableId="32003774">
+    <w:abstractNumId w:val="5"/>
+  </w:num>
+  <w:num w:numId="7" w16cid:durableId="792870585">
+    <w:abstractNumId w:val="36"/>
+  </w:num>
+  <w:num w:numId="8" w16cid:durableId="2005433669">
+    <w:abstractNumId w:val="10"/>
+  </w:num>
+  <w:num w:numId="9" w16cid:durableId="962542288">
+    <w:abstractNumId w:val="24"/>
+  </w:num>
+  <w:num w:numId="10" w16cid:durableId="672418293">
+    <w:abstractNumId w:val="3"/>
+  </w:num>
+  <w:num w:numId="11" w16cid:durableId="1626764764">
+    <w:abstractNumId w:val="26"/>
+  </w:num>
+  <w:num w:numId="12" w16cid:durableId="1161311191">
+    <w:abstractNumId w:val="34"/>
+  </w:num>
+  <w:num w:numId="13" w16cid:durableId="483933059">
+    <w:abstractNumId w:val="29"/>
+  </w:num>
+  <w:num w:numId="14" w16cid:durableId="150365615">
+    <w:abstractNumId w:val="27"/>
+  </w:num>
+  <w:num w:numId="15" w16cid:durableId="1869561520">
+    <w:abstractNumId w:val="18"/>
+  </w:num>
+  <w:num w:numId="16" w16cid:durableId="432745805">
+    <w:abstractNumId w:val="25"/>
+  </w:num>
+  <w:num w:numId="17" w16cid:durableId="239219319">
+    <w:abstractNumId w:val="16"/>
+  </w:num>
+  <w:num w:numId="18" w16cid:durableId="239753529">
+    <w:abstractNumId w:val="17"/>
+  </w:num>
+  <w:num w:numId="19" w16cid:durableId="1417045849">
+    <w:abstractNumId w:val="9"/>
+  </w:num>
+  <w:num w:numId="20" w16cid:durableId="422605777">
+    <w:abstractNumId w:val="33"/>
+  </w:num>
+  <w:num w:numId="21" w16cid:durableId="1891108399">
+    <w:abstractNumId w:val="30"/>
+  </w:num>
+  <w:num w:numId="22" w16cid:durableId="727338320">
+    <w:abstractNumId w:val="20"/>
+  </w:num>
+  <w:num w:numId="23" w16cid:durableId="348409831">
+    <w:abstractNumId w:val="12"/>
+  </w:num>
+  <w:num w:numId="24" w16cid:durableId="2121869904">
+    <w:abstractNumId w:val="1"/>
+  </w:num>
+  <w:num w:numId="25" w16cid:durableId="1740857139">
+    <w:abstractNumId w:val="32"/>
+  </w:num>
+  <w:num w:numId="26" w16cid:durableId="429785710">
+    <w:abstractNumId w:val="35"/>
+  </w:num>
+  <w:num w:numId="27" w16cid:durableId="954991769">
+    <w:abstractNumId w:val="15"/>
+  </w:num>
+  <w:num w:numId="28" w16cid:durableId="255289129">
+    <w:abstractNumId w:val="28"/>
+  </w:num>
+  <w:num w:numId="29" w16cid:durableId="1510561876">
+    <w:abstractNumId w:val="37"/>
+  </w:num>
+  <w:num w:numId="30" w16cid:durableId="1677462096">
+    <w:abstractNumId w:val="4"/>
+  </w:num>
+  <w:num w:numId="31" w16cid:durableId="1585185791">
+    <w:abstractNumId w:val="2"/>
+  </w:num>
+  <w:num w:numId="32" w16cid:durableId="1019546538">
+    <w:abstractNumId w:val="13"/>
+  </w:num>
+  <w:num w:numId="33" w16cid:durableId="1951232040">
+    <w:abstractNumId w:val="0"/>
+  </w:num>
+  <w:num w:numId="34" w16cid:durableId="1954094448">
+    <w:abstractNumId w:val="6"/>
+  </w:num>
+  <w:num w:numId="35" w16cid:durableId="1410230622">
+    <w:abstractNumId w:val="8"/>
+  </w:num>
+  <w:num w:numId="36" w16cid:durableId="2116634318">
     <w:abstractNumId w:val="7"/>
   </w:num>
-  <w:num w:numId="2" w16cid:durableId="1423454805">
-    <w:abstractNumId w:val="5"/>
-  </w:num>
-  <w:num w:numId="3" w16cid:durableId="1249995567">
-    <w:abstractNumId w:val="12"/>
-  </w:num>
-  <w:num w:numId="4" w16cid:durableId="1318655865">
-    <w:abstractNumId w:val="14"/>
-  </w:num>
-  <w:num w:numId="5" w16cid:durableId="1364405303">
-    <w:abstractNumId w:val="22"/>
-  </w:num>
-  <w:num w:numId="6" w16cid:durableId="32003774">
-    <w:abstractNumId w:val="2"/>
-  </w:num>
-  <w:num w:numId="7" w16cid:durableId="792870585">
-    <w:abstractNumId w:val="27"/>
-  </w:num>
-  <w:num w:numId="8" w16cid:durableId="2005433669">
-    <w:abstractNumId w:val="4"/>
-  </w:num>
-  <w:num w:numId="9" w16cid:durableId="962542288">
-    <w:abstractNumId w:val="15"/>
-  </w:num>
-  <w:num w:numId="10" w16cid:durableId="672418293">
-    <w:abstractNumId w:val="1"/>
-  </w:num>
-  <w:num w:numId="11" w16cid:durableId="1626764764">
-    <w:abstractNumId w:val="17"/>
-  </w:num>
-  <w:num w:numId="12" w16cid:durableId="1161311191">
-    <w:abstractNumId w:val="25"/>
-  </w:num>
-  <w:num w:numId="13" w16cid:durableId="483933059">
-    <w:abstractNumId w:val="20"/>
-  </w:num>
-  <w:num w:numId="14" w16cid:durableId="150365615">
-    <w:abstractNumId w:val="18"/>
-  </w:num>
-  <w:num w:numId="15" w16cid:durableId="1869561520">
-    <w:abstractNumId w:val="11"/>
-  </w:num>
-  <w:num w:numId="16" w16cid:durableId="432745805">
-    <w:abstractNumId w:val="16"/>
-  </w:num>
-  <w:num w:numId="17" w16cid:durableId="239219319">
-    <w:abstractNumId w:val="9"/>
-  </w:num>
-  <w:num w:numId="18" w16cid:durableId="239753529">
-    <w:abstractNumId w:val="10"/>
-  </w:num>
-  <w:num w:numId="19" w16cid:durableId="1417045849">
-    <w:abstractNumId w:val="3"/>
-  </w:num>
-  <w:num w:numId="20" w16cid:durableId="422605777">
-    <w:abstractNumId w:val="24"/>
-  </w:num>
-  <w:num w:numId="21" w16cid:durableId="1891108399">
+  <w:num w:numId="37" w16cid:durableId="379982145">
     <w:abstractNumId w:val="21"/>
   </w:num>
-  <w:num w:numId="22" w16cid:durableId="727338320">
-    <w:abstractNumId w:val="13"/>
-  </w:num>
-  <w:num w:numId="23" w16cid:durableId="348409831">
-    <w:abstractNumId w:val="6"/>
-  </w:num>
-  <w:num w:numId="24" w16cid:durableId="2121869904">
-    <w:abstractNumId w:val="0"/>
-  </w:num>
-  <w:num w:numId="25" w16cid:durableId="1740857139">
-    <w:abstractNumId w:val="23"/>
-  </w:num>
-  <w:num w:numId="26" w16cid:durableId="429785710">
-    <w:abstractNumId w:val="26"/>
-  </w:num>
-  <w:num w:numId="27" w16cid:durableId="954991769">
-    <w:abstractNumId w:val="8"/>
-  </w:num>
-  <w:num w:numId="28" w16cid:durableId="255289129">
-    <w:abstractNumId w:val="19"/>
-  </w:num>
-  <w:num w:numId="29" w16cid:durableId="1510561876">
-    <w:abstractNumId w:val="28"/>
+  <w:num w:numId="38" w16cid:durableId="100497367">
+    <w:abstractNumId w:val="22"/>
   </w:num>
 </w:numbering>
 </file>
@@ -9588,10 +10976,213 @@
 <b:Sources xmlns:b="http://schemas.openxmlformats.org/officeDocument/2006/bibliography" xmlns="http://schemas.openxmlformats.org/officeDocument/2006/bibliography" SelectedStyle="\APASixthEditionOfficeOnline.xsl" StyleName="APA" Version="6"/>
 </file>
 
+<file path=customXml/item2.xml><?xml version="1.0" encoding="utf-8"?>
+<ct:contentTypeSchema xmlns:ct="http://schemas.microsoft.com/office/2006/metadata/contentType" xmlns:ma="http://schemas.microsoft.com/office/2006/metadata/properties/metaAttributes" ct:_="" ma:_="" ma:contentTypeName="Document" ma:contentTypeID="0x01010078273A7D4934C04A915788E28F2677E3" ma:contentTypeVersion="5" ma:contentTypeDescription="Create a new document." ma:contentTypeScope="" ma:versionID="138dbf5f4856cdfb462f6a186fdd2bd5">
+  <xsd:schema xmlns:xsd="http://www.w3.org/2001/XMLSchema" xmlns:xs="http://www.w3.org/2001/XMLSchema" xmlns:p="http://schemas.microsoft.com/office/2006/metadata/properties" xmlns:ns3="90562612-f2b8-495f-a102-6d85350d64ad" targetNamespace="http://schemas.microsoft.com/office/2006/metadata/properties" ma:root="true" ma:fieldsID="aeac069d50bea9a472d9291e5b4d6b54" ns3:_="">
+    <xsd:import namespace="90562612-f2b8-495f-a102-6d85350d64ad"/>
+    <xsd:element name="properties">
+      <xsd:complexType>
+        <xsd:sequence>
+          <xsd:element name="documentManagement">
+            <xsd:complexType>
+              <xsd:all>
+                <xsd:element ref="ns3:MediaServiceDateTaken" minOccurs="0"/>
+                <xsd:element ref="ns3:_activity" minOccurs="0"/>
+                <xsd:element ref="ns3:MediaServiceMetadata" minOccurs="0"/>
+                <xsd:element ref="ns3:MediaServiceFastMetadata" minOccurs="0"/>
+                <xsd:element ref="ns3:MediaServiceSearchProperties" minOccurs="0"/>
+              </xsd:all>
+            </xsd:complexType>
+          </xsd:element>
+        </xsd:sequence>
+      </xsd:complexType>
+    </xsd:element>
+  </xsd:schema>
+  <xsd:schema xmlns:xsd="http://www.w3.org/2001/XMLSchema" xmlns:xs="http://www.w3.org/2001/XMLSchema" xmlns:dms="http://schemas.microsoft.com/office/2006/documentManagement/types" xmlns:pc="http://schemas.microsoft.com/office/infopath/2007/PartnerControls" targetNamespace="90562612-f2b8-495f-a102-6d85350d64ad" elementFormDefault="qualified">
+    <xsd:import namespace="http://schemas.microsoft.com/office/2006/documentManagement/types"/>
+    <xsd:import namespace="http://schemas.microsoft.com/office/infopath/2007/PartnerControls"/>
+    <xsd:element name="MediaServiceDateTaken" ma:index="8" nillable="true" ma:displayName="MediaServiceDateTaken" ma:hidden="true" ma:indexed="true" ma:internalName="MediaServiceDateTaken" ma:readOnly="true">
+      <xsd:simpleType>
+        <xsd:restriction base="dms:Text"/>
+      </xsd:simpleType>
+    </xsd:element>
+    <xsd:element name="_activity" ma:index="9" nillable="true" ma:displayName="_activity" ma:hidden="true" ma:internalName="_activity">
+      <xsd:simpleType>
+        <xsd:restriction base="dms:Note"/>
+      </xsd:simpleType>
+    </xsd:element>
+    <xsd:element name="MediaServiceMetadata" ma:index="10" nillable="true" ma:displayName="MediaServiceMetadata" ma:hidden="true" ma:internalName="MediaServiceMetadata" ma:readOnly="true">
+      <xsd:simpleType>
+        <xsd:restriction base="dms:Note"/>
+      </xsd:simpleType>
+    </xsd:element>
+    <xsd:element name="MediaServiceFastMetadata" ma:index="11" nillable="true" ma:displayName="MediaServiceFastMetadata" ma:hidden="true" ma:internalName="MediaServiceFastMetadata" ma:readOnly="true">
+      <xsd:simpleType>
+        <xsd:restriction base="dms:Note"/>
+      </xsd:simpleType>
+    </xsd:element>
+    <xsd:element name="MediaServiceSearchProperties" ma:index="12" nillable="true" ma:displayName="MediaServiceSearchProperties" ma:hidden="true" ma:internalName="MediaServiceSearchProperties" ma:readOnly="true">
+      <xsd:simpleType>
+        <xsd:restriction base="dms:Note"/>
+      </xsd:simpleType>
+    </xsd:element>
+  </xsd:schema>
+  <xsd:schema xmlns="http://schemas.openxmlformats.org/package/2006/metadata/core-properties" xmlns:xsd="http://www.w3.org/2001/XMLSchema" xmlns:xsi="http://www.w3.org/2001/XMLSchema-instance" xmlns:dc="http://purl.org/dc/elements/1.1/" xmlns:dcterms="http://purl.org/dc/terms/" xmlns:odoc="http://schemas.microsoft.com/internal/obd" targetNamespace="http://schemas.openxmlformats.org/package/2006/metadata/core-properties" elementFormDefault="qualified" attributeFormDefault="unqualified" blockDefault="#all">
+    <xsd:import namespace="http://purl.org/dc/elements/1.1/" schemaLocation="http://dublincore.org/schemas/xmls/qdc/2003/04/02/dc.xsd"/>
+    <xsd:import namespace="http://purl.org/dc/terms/" schemaLocation="http://dublincore.org/schemas/xmls/qdc/2003/04/02/dcterms.xsd"/>
+    <xsd:element name="coreProperties" type="CT_coreProperties"/>
+    <xsd:complexType name="CT_coreProperties">
+      <xsd:all>
+        <xsd:element ref="dc:creator" minOccurs="0" maxOccurs="1"/>
+        <xsd:element ref="dcterms:created" minOccurs="0" maxOccurs="1"/>
+        <xsd:element ref="dc:identifier" minOccurs="0" maxOccurs="1"/>
+        <xsd:element name="contentType" minOccurs="0" maxOccurs="1" type="xsd:string" ma:index="0" ma:displayName="Content Type"/>
+        <xsd:element ref="dc:title" minOccurs="0" maxOccurs="1" ma:index="4" ma:displayName="Title"/>
+        <xsd:element ref="dc:subject" minOccurs="0" maxOccurs="1"/>
+        <xsd:element ref="dc:description" minOccurs="0" maxOccurs="1"/>
+        <xsd:element name="keywords" minOccurs="0" maxOccurs="1" type="xsd:string"/>
+        <xsd:element ref="dc:language" minOccurs="0" maxOccurs="1"/>
+        <xsd:element name="category" minOccurs="0" maxOccurs="1" type="xsd:string"/>
+        <xsd:element name="version" minOccurs="0" maxOccurs="1" type="xsd:string"/>
+        <xsd:element name="revision" minOccurs="0" maxOccurs="1" type="xsd:string">
+          <xsd:annotation>
+            <xsd:documentation>
+                        This value indicates the number of saves or revisions. The application is responsible for updating this value after each revision.
+                    </xsd:documentation>
+          </xsd:annotation>
+        </xsd:element>
+        <xsd:element name="lastModifiedBy" minOccurs="0" maxOccurs="1" type="xsd:string"/>
+        <xsd:element ref="dcterms:modified" minOccurs="0" maxOccurs="1"/>
+        <xsd:element name="contentStatus" minOccurs="0" maxOccurs="1" type="xsd:string"/>
+      </xsd:all>
+    </xsd:complexType>
+  </xsd:schema>
+  <xs:schema xmlns:pc="http://schemas.microsoft.com/office/infopath/2007/PartnerControls" xmlns:xs="http://www.w3.org/2001/XMLSchema" targetNamespace="http://schemas.microsoft.com/office/infopath/2007/PartnerControls" elementFormDefault="qualified" attributeFormDefault="unqualified">
+    <xs:element name="Person">
+      <xs:complexType>
+        <xs:sequence>
+          <xs:element ref="pc:DisplayName" minOccurs="0"/>
+          <xs:element ref="pc:AccountId" minOccurs="0"/>
+          <xs:element ref="pc:AccountType" minOccurs="0"/>
+        </xs:sequence>
+      </xs:complexType>
+    </xs:element>
+    <xs:element name="DisplayName" type="xs:string"/>
+    <xs:element name="AccountId" type="xs:string"/>
+    <xs:element name="AccountType" type="xs:string"/>
+    <xs:element name="BDCAssociatedEntity">
+      <xs:complexType>
+        <xs:sequence>
+          <xs:element ref="pc:BDCEntity" minOccurs="0" maxOccurs="unbounded"/>
+        </xs:sequence>
+        <xs:attribute ref="pc:EntityNamespace"/>
+        <xs:attribute ref="pc:EntityName"/>
+        <xs:attribute ref="pc:SystemInstanceName"/>
+        <xs:attribute ref="pc:AssociationName"/>
+      </xs:complexType>
+    </xs:element>
+    <xs:attribute name="EntityNamespace" type="xs:string"/>
+    <xs:attribute name="EntityName" type="xs:string"/>
+    <xs:attribute name="SystemInstanceName" type="xs:string"/>
+    <xs:attribute name="AssociationName" type="xs:string"/>
+    <xs:element name="BDCEntity">
+      <xs:complexType>
+        <xs:sequence>
+          <xs:element ref="pc:EntityDisplayName" minOccurs="0"/>
+          <xs:element ref="pc:EntityInstanceReference" minOccurs="0"/>
+          <xs:element ref="pc:EntityId1" minOccurs="0"/>
+          <xs:element ref="pc:EntityId2" minOccurs="0"/>
+          <xs:element ref="pc:EntityId3" minOccurs="0"/>
+          <xs:element ref="pc:EntityId4" minOccurs="0"/>
+          <xs:element ref="pc:EntityId5" minOccurs="0"/>
+        </xs:sequence>
+      </xs:complexType>
+    </xs:element>
+    <xs:element name="EntityDisplayName" type="xs:string"/>
+    <xs:element name="EntityInstanceReference" type="xs:string"/>
+    <xs:element name="EntityId1" type="xs:string"/>
+    <xs:element name="EntityId2" type="xs:string"/>
+    <xs:element name="EntityId3" type="xs:string"/>
+    <xs:element name="EntityId4" type="xs:string"/>
+    <xs:element name="EntityId5" type="xs:string"/>
+    <xs:element name="Terms">
+      <xs:complexType>
+        <xs:sequence>
+          <xs:element ref="pc:TermInfo" minOccurs="0" maxOccurs="unbounded"/>
+        </xs:sequence>
+      </xs:complexType>
+    </xs:element>
+    <xs:element name="TermInfo">
+      <xs:complexType>
+        <xs:sequence>
+          <xs:element ref="pc:TermName" minOccurs="0"/>
+          <xs:element ref="pc:TermId" minOccurs="0"/>
+        </xs:sequence>
+      </xs:complexType>
+    </xs:element>
+    <xs:element name="TermName" type="xs:string"/>
+    <xs:element name="TermId" type="xs:string"/>
+  </xs:schema>
+</ct:contentTypeSchema>
+</file>
+
+<file path=customXml/item3.xml><?xml version="1.0" encoding="utf-8"?>
+<?mso-contentType ?>
+<FormTemplates xmlns="http://schemas.microsoft.com/sharepoint/v3/contenttype/forms">
+  <Display>DocumentLibraryForm</Display>
+  <Edit>DocumentLibraryForm</Edit>
+  <New>DocumentLibraryForm</New>
+</FormTemplates>
+</file>
+
+<file path=customXml/item4.xml><?xml version="1.0" encoding="utf-8"?>
+<p:properties xmlns:p="http://schemas.microsoft.com/office/2006/metadata/properties" xmlns:xsi="http://www.w3.org/2001/XMLSchema-instance" xmlns:pc="http://schemas.microsoft.com/office/infopath/2007/PartnerControls">
+  <documentManagement>
+    <_activity xmlns="90562612-f2b8-495f-a102-6d85350d64ad" xsi:nil="true"/>
+  </documentManagement>
+</p:properties>
+</file>
+
 <file path=customXml/itemProps1.xml><?xml version="1.0" encoding="utf-8"?>
 <ds:datastoreItem xmlns:ds="http://schemas.openxmlformats.org/officeDocument/2006/customXml" ds:itemID="{99797C72-CFA6-4EFB-ACE4-6120274DE2C2}">
   <ds:schemaRefs>
     <ds:schemaRef ds:uri="http://schemas.openxmlformats.org/officeDocument/2006/bibliography"/>
   </ds:schemaRefs>
 </ds:datastoreItem>
+</file>
+
+<file path=customXml/itemProps2.xml><?xml version="1.0" encoding="utf-8"?>
+<ds:datastoreItem xmlns:ds="http://schemas.openxmlformats.org/officeDocument/2006/customXml" ds:itemID="{6062BC53-DE6F-49B9-800B-0B90DD3F26EF}">
+  <ds:schemaRefs>
+    <ds:schemaRef ds:uri="http://schemas.microsoft.com/office/2006/metadata/contentType"/>
+    <ds:schemaRef ds:uri="http://schemas.microsoft.com/office/2006/metadata/properties/metaAttributes"/>
+    <ds:schemaRef ds:uri="http://www.w3.org/2001/XMLSchema"/>
+    <ds:schemaRef ds:uri="http://schemas.microsoft.com/office/2006/metadata/properties"/>
+    <ds:schemaRef ds:uri="90562612-f2b8-495f-a102-6d85350d64ad"/>
+    <ds:schemaRef ds:uri="http://schemas.microsoft.com/office/2006/documentManagement/types"/>
+    <ds:schemaRef ds:uri="http://schemas.microsoft.com/office/infopath/2007/PartnerControls"/>
+    <ds:schemaRef ds:uri="http://schemas.openxmlformats.org/package/2006/metadata/core-properties"/>
+    <ds:schemaRef ds:uri="http://purl.org/dc/elements/1.1/"/>
+    <ds:schemaRef ds:uri="http://purl.org/dc/terms/"/>
+    <ds:schemaRef ds:uri="http://schemas.microsoft.com/internal/obd"/>
+  </ds:schemaRefs>
+</ds:datastoreItem>
+</file>
+
+<file path=customXml/itemProps3.xml><?xml version="1.0" encoding="utf-8"?>
+<ds:datastoreItem xmlns:ds="http://schemas.openxmlformats.org/officeDocument/2006/customXml" ds:itemID="{971C8FCF-77C3-4641-86EA-B17B85CE8D9D}">
+  <ds:schemaRefs>
+    <ds:schemaRef ds:uri="http://schemas.microsoft.com/sharepoint/v3/contenttype/forms"/>
+  </ds:schemaRefs>
+</ds:datastoreItem>
+</file>
+
+<file path=customXml/itemProps4.xml><?xml version="1.0" encoding="utf-8"?>
+<ds:datastoreItem xmlns:ds="http://schemas.openxmlformats.org/officeDocument/2006/customXml" ds:itemID="{599215DE-D713-4E07-8DC6-208A2B0D4BD6}">
+  <ds:schemaRefs>
+    <ds:schemaRef ds:uri="http://schemas.microsoft.com/office/2006/metadata/properties"/>
+    <ds:schemaRef ds:uri="http://schemas.microsoft.com/office/infopath/2007/PartnerControls"/>
+    <ds:schemaRef ds:uri="90562612-f2b8-495f-a102-6d85350d64ad"/>
+  </ds:schemaRefs>
+</ds:datastoreItem>
 </file>
</xml_diff>

<commit_message>
Made changes regarding switching of llm from Anthropic to Groq
</commit_message>
<xml_diff>
--- a/docs/2_Requirement/1_SRS.docx
+++ b/docs/2_Requirement/1_SRS.docx
@@ -3367,7 +3367,25 @@
           <w:i w:val="0"/>
           <w:iCs/>
         </w:rPr>
-        <w:t>The system generates three personalized recommendations — one music suggestion, one activity, and one reflection — by sending the user's confirmed mood and their last three journal entries as context to the Anthropic AI API. Recommendations are streamed back in real time and saved to the database linked to the current journal entry.</w:t>
+        <w:t xml:space="preserve">The system generates three personalized recommendations — one music suggestion, one activity, and one reflection — by sending the user's confirmed mood and their last three journal entries as context to the </w:t>
+      </w:r>
+      <w:proofErr w:type="spellStart"/>
+      <w:r>
+        <w:rPr>
+          <w:rFonts w:ascii="Times New Roman" w:hAnsi="Times New Roman" w:cs="Times New Roman"/>
+          <w:i w:val="0"/>
+          <w:iCs/>
+        </w:rPr>
+        <w:t>Groq</w:t>
+      </w:r>
+      <w:proofErr w:type="spellEnd"/>
+      <w:r>
+        <w:rPr>
+          <w:rFonts w:ascii="Times New Roman" w:hAnsi="Times New Roman" w:cs="Times New Roman"/>
+          <w:i w:val="0"/>
+          <w:iCs/>
+        </w:rPr>
+        <w:t xml:space="preserve"> AI API. Recommendations are streamed back in real time and saved to the database linked to the current journal entry.</w:t>
       </w:r>
     </w:p>
     <w:p>
@@ -3445,23 +3463,25 @@
           <w:i w:val="0"/>
           <w:iCs/>
         </w:rPr>
-        <w:t>User confirms mood → server fetches last 3 journal entries from DB</w:t>
-      </w:r>
+        <w:t xml:space="preserve">User confirms mood → server fetches last 3 journal entries from DB as context → mood + journal context sent to </w:t>
+      </w:r>
+      <w:proofErr w:type="spellStart"/>
       <w:r>
         <w:rPr>
           <w:rFonts w:ascii="Times New Roman" w:hAnsi="Times New Roman" w:cs="Times New Roman"/>
           <w:i w:val="0"/>
           <w:iCs/>
         </w:rPr>
-        <w:t xml:space="preserve"> as context</w:t>
-      </w:r>
+        <w:t>Groq</w:t>
+      </w:r>
+      <w:proofErr w:type="spellEnd"/>
       <w:r>
         <w:rPr>
           <w:rFonts w:ascii="Times New Roman" w:hAnsi="Times New Roman" w:cs="Times New Roman"/>
           <w:i w:val="0"/>
           <w:iCs/>
         </w:rPr>
-        <w:t xml:space="preserve"> → mood + journal context sent to Anthropic API → response streams back token by token → 3 recommendations rendered in UI as they arrive → recommendations saved to DB linked to current journal entry</w:t>
+        <w:t xml:space="preserve"> API → response streams back token by token → 3 recommendations rendered in UI as they arrive → recommendations saved to DB linked to current journal entry</w:t>
       </w:r>
     </w:p>
     <w:p>
@@ -3484,7 +3504,25 @@
           <w:i w:val="0"/>
           <w:iCs/>
         </w:rPr>
-        <w:t>New user with no history → mood sent to Anthropic API without context → generic but valid recommendations generated and displayed</w:t>
+        <w:t xml:space="preserve">New user with no history → mood sent to </w:t>
+      </w:r>
+      <w:proofErr w:type="spellStart"/>
+      <w:r>
+        <w:rPr>
+          <w:rFonts w:ascii="Times New Roman" w:hAnsi="Times New Roman" w:cs="Times New Roman"/>
+          <w:i w:val="0"/>
+          <w:iCs/>
+        </w:rPr>
+        <w:t>Groq</w:t>
+      </w:r>
+      <w:proofErr w:type="spellEnd"/>
+      <w:r>
+        <w:rPr>
+          <w:rFonts w:ascii="Times New Roman" w:hAnsi="Times New Roman" w:cs="Times New Roman"/>
+          <w:i w:val="0"/>
+          <w:iCs/>
+        </w:rPr>
+        <w:t xml:space="preserve"> API without context → generic but valid recommendations generated and displayed</w:t>
       </w:r>
     </w:p>
     <w:p>
@@ -3635,7 +3673,23 @@
           <w:rFonts w:ascii="Times New Roman" w:hAnsi="Times New Roman" w:cs="Times New Roman"/>
           <w:i w:val="0"/>
         </w:rPr>
-        <w:t xml:space="preserve"> The system shall send the current mood label and journal history to the Anthropic API using the </w:t>
+        <w:t xml:space="preserve"> The system shall send the current mood label and journal history to the </w:t>
+      </w:r>
+      <w:proofErr w:type="spellStart"/>
+      <w:r>
+        <w:rPr>
+          <w:rFonts w:ascii="Times New Roman" w:hAnsi="Times New Roman" w:cs="Times New Roman"/>
+          <w:i w:val="0"/>
+        </w:rPr>
+        <w:t>Groq</w:t>
+      </w:r>
+      <w:proofErr w:type="spellEnd"/>
+      <w:r>
+        <w:rPr>
+          <w:rFonts w:ascii="Times New Roman" w:hAnsi="Times New Roman" w:cs="Times New Roman"/>
+          <w:i w:val="0"/>
+        </w:rPr>
+        <w:t xml:space="preserve"> API using the </w:t>
       </w:r>
       <w:proofErr w:type="spellStart"/>
       <w:r>
@@ -3812,7 +3866,23 @@
           <w:rFonts w:ascii="Times New Roman" w:hAnsi="Times New Roman" w:cs="Times New Roman"/>
           <w:i w:val="0"/>
         </w:rPr>
-        <w:t xml:space="preserve"> The system shall handle Anthropic API failures gracefully by displaying an error message to the user while preserving the saved journal entry. </w:t>
+        <w:t xml:space="preserve"> The system shall handle </w:t>
+      </w:r>
+      <w:proofErr w:type="spellStart"/>
+      <w:r>
+        <w:rPr>
+          <w:rFonts w:ascii="Times New Roman" w:hAnsi="Times New Roman" w:cs="Times New Roman"/>
+          <w:i w:val="0"/>
+        </w:rPr>
+        <w:t>Groq</w:t>
+      </w:r>
+      <w:proofErr w:type="spellEnd"/>
+      <w:r>
+        <w:rPr>
+          <w:rFonts w:ascii="Times New Roman" w:hAnsi="Times New Roman" w:cs="Times New Roman"/>
+          <w:i w:val="0"/>
+        </w:rPr>
+        <w:t xml:space="preserve"> API failures gracefully by displaying an error message to the user while preserving the saved journal entry. </w:t>
       </w:r>
     </w:p>
     <w:p>
@@ -10415,6 +10485,7 @@
   <w:style w:type="character" w:default="1" w:styleId="DefaultParagraphFont">
     <w:name w:val="Default Paragraph Font"/>
     <w:uiPriority w:val="1"/>
+    <w:semiHidden/>
     <w:unhideWhenUsed/>
   </w:style>
   <w:style w:type="table" w:default="1" w:styleId="TableNormal">
@@ -10973,10 +11044,6 @@
 </file>
 
 <file path=customXml/item1.xml><?xml version="1.0" encoding="utf-8"?>
-<b:Sources xmlns:b="http://schemas.openxmlformats.org/officeDocument/2006/bibliography" xmlns="http://schemas.openxmlformats.org/officeDocument/2006/bibliography" SelectedStyle="\APASixthEditionOfficeOnline.xsl" StyleName="APA" Version="6"/>
-</file>
-
-<file path=customXml/item2.xml><?xml version="1.0" encoding="utf-8"?>
 <ct:contentTypeSchema xmlns:ct="http://schemas.microsoft.com/office/2006/metadata/contentType" xmlns:ma="http://schemas.microsoft.com/office/2006/metadata/properties/metaAttributes" ct:_="" ma:_="" ma:contentTypeName="Document" ma:contentTypeID="0x01010078273A7D4934C04A915788E28F2677E3" ma:contentTypeVersion="5" ma:contentTypeDescription="Create a new document." ma:contentTypeScope="" ma:versionID="138dbf5f4856cdfb462f6a186fdd2bd5">
   <xsd:schema xmlns:xsd="http://www.w3.org/2001/XMLSchema" xmlns:xs="http://www.w3.org/2001/XMLSchema" xmlns:p="http://schemas.microsoft.com/office/2006/metadata/properties" xmlns:ns3="90562612-f2b8-495f-a102-6d85350d64ad" targetNamespace="http://schemas.microsoft.com/office/2006/metadata/properties" ma:root="true" ma:fieldsID="aeac069d50bea9a472d9291e5b4d6b54" ns3:_="">
     <xsd:import namespace="90562612-f2b8-495f-a102-6d85350d64ad"/>
@@ -11126,7 +11193,19 @@
 </ct:contentTypeSchema>
 </file>
 
+<file path=customXml/item2.xml><?xml version="1.0" encoding="utf-8"?>
+<b:Sources xmlns:b="http://schemas.openxmlformats.org/officeDocument/2006/bibliography" xmlns="http://schemas.openxmlformats.org/officeDocument/2006/bibliography" SelectedStyle="\APASixthEditionOfficeOnline.xsl" StyleName="APA" Version="6"/>
+</file>
+
 <file path=customXml/item3.xml><?xml version="1.0" encoding="utf-8"?>
+<p:properties xmlns:p="http://schemas.microsoft.com/office/2006/metadata/properties" xmlns:xsi="http://www.w3.org/2001/XMLSchema-instance" xmlns:pc="http://schemas.microsoft.com/office/infopath/2007/PartnerControls">
+  <documentManagement>
+    <_activity xmlns="90562612-f2b8-495f-a102-6d85350d64ad" xsi:nil="true"/>
+  </documentManagement>
+</p:properties>
+</file>
+
+<file path=customXml/item4.xml><?xml version="1.0" encoding="utf-8"?>
 <?mso-contentType ?>
 <FormTemplates xmlns="http://schemas.microsoft.com/sharepoint/v3/contenttype/forms">
   <Display>DocumentLibraryForm</Display>
@@ -11135,23 +11214,7 @@
 </FormTemplates>
 </file>
 
-<file path=customXml/item4.xml><?xml version="1.0" encoding="utf-8"?>
-<p:properties xmlns:p="http://schemas.microsoft.com/office/2006/metadata/properties" xmlns:xsi="http://www.w3.org/2001/XMLSchema-instance" xmlns:pc="http://schemas.microsoft.com/office/infopath/2007/PartnerControls">
-  <documentManagement>
-    <_activity xmlns="90562612-f2b8-495f-a102-6d85350d64ad" xsi:nil="true"/>
-  </documentManagement>
-</p:properties>
-</file>
-
 <file path=customXml/itemProps1.xml><?xml version="1.0" encoding="utf-8"?>
-<ds:datastoreItem xmlns:ds="http://schemas.openxmlformats.org/officeDocument/2006/customXml" ds:itemID="{99797C72-CFA6-4EFB-ACE4-6120274DE2C2}">
-  <ds:schemaRefs>
-    <ds:schemaRef ds:uri="http://schemas.openxmlformats.org/officeDocument/2006/bibliography"/>
-  </ds:schemaRefs>
-</ds:datastoreItem>
-</file>
-
-<file path=customXml/itemProps2.xml><?xml version="1.0" encoding="utf-8"?>
 <ds:datastoreItem xmlns:ds="http://schemas.openxmlformats.org/officeDocument/2006/customXml" ds:itemID="{6062BC53-DE6F-49B9-800B-0B90DD3F26EF}">
   <ds:schemaRefs>
     <ds:schemaRef ds:uri="http://schemas.microsoft.com/office/2006/metadata/contentType"/>
@@ -11169,15 +11232,15 @@
 </ds:datastoreItem>
 </file>
 
-<file path=customXml/itemProps3.xml><?xml version="1.0" encoding="utf-8"?>
-<ds:datastoreItem xmlns:ds="http://schemas.openxmlformats.org/officeDocument/2006/customXml" ds:itemID="{971C8FCF-77C3-4641-86EA-B17B85CE8D9D}">
+<file path=customXml/itemProps2.xml><?xml version="1.0" encoding="utf-8"?>
+<ds:datastoreItem xmlns:ds="http://schemas.openxmlformats.org/officeDocument/2006/customXml" ds:itemID="{99797C72-CFA6-4EFB-ACE4-6120274DE2C2}">
   <ds:schemaRefs>
-    <ds:schemaRef ds:uri="http://schemas.microsoft.com/sharepoint/v3/contenttype/forms"/>
+    <ds:schemaRef ds:uri="http://schemas.openxmlformats.org/officeDocument/2006/bibliography"/>
   </ds:schemaRefs>
 </ds:datastoreItem>
 </file>
 
-<file path=customXml/itemProps4.xml><?xml version="1.0" encoding="utf-8"?>
+<file path=customXml/itemProps3.xml><?xml version="1.0" encoding="utf-8"?>
 <ds:datastoreItem xmlns:ds="http://schemas.openxmlformats.org/officeDocument/2006/customXml" ds:itemID="{599215DE-D713-4E07-8DC6-208A2B0D4BD6}">
   <ds:schemaRefs>
     <ds:schemaRef ds:uri="http://schemas.microsoft.com/office/2006/metadata/properties"/>
@@ -11185,4 +11248,12 @@
     <ds:schemaRef ds:uri="90562612-f2b8-495f-a102-6d85350d64ad"/>
   </ds:schemaRefs>
 </ds:datastoreItem>
+</file>
+
+<file path=customXml/itemProps4.xml><?xml version="1.0" encoding="utf-8"?>
+<ds:datastoreItem xmlns:ds="http://schemas.openxmlformats.org/officeDocument/2006/customXml" ds:itemID="{971C8FCF-77C3-4641-86EA-B17B85CE8D9D}">
+  <ds:schemaRefs>
+    <ds:schemaRef ds:uri="http://schemas.microsoft.com/sharepoint/v3/contenttype/forms"/>
+  </ds:schemaRefs>
+</ds:datastoreItem>
 </file>
</xml_diff>